<commit_message>
Align AOSR DOCX fields with template
</commit_message>
<xml_diff>
--- a/apps/web/public/templates/aosr/AOSR1_template_final_tags_corrected.docx
+++ b/apps/web/public/templates/aosr/AOSR1_template_final_tags_corrected.docx
@@ -1,6 +1,6 @@
 
 <file path=word/document.xml><?xml version="1.0" encoding="utf-8"?>
-<w:document xmlns:wpc="http://schemas.microsoft.com/office/word/2010/wordprocessingCanvas" xmlns:cx="http://schemas.microsoft.com/office/drawing/2014/chartex" xmlns:cx1="http://schemas.microsoft.com/office/drawing/2015/9/8/chartex" xmlns:cx2="http://schemas.microsoft.com/office/drawing/2015/10/21/chartex" xmlns:cx3="http://schemas.microsoft.com/office/drawing/2016/5/9/chartex" xmlns:cx4="http://schemas.microsoft.com/office/drawing/2016/5/10/chartex" xmlns:cx5="http://schemas.microsoft.com/office/drawing/2016/5/11/chartex" xmlns:cx6="http://schemas.microsoft.com/office/drawing/2016/5/12/chartex" xmlns:cx7="http://schemas.microsoft.com/office/drawing/2016/5/13/chartex" xmlns:cx8="http://schemas.microsoft.com/office/drawing/2016/5/14/chartex" xmlns:mc="http://schemas.openxmlformats.org/markup-compatibility/2006" xmlns:aink="http://schemas.microsoft.com/office/drawing/2016/ink" xmlns:am3d="http://schemas.microsoft.com/office/drawing/2017/model3d" xmlns:o="urn:schemas-microsoft-com:office:office" xmlns:oel="http://schemas.microsoft.com/office/2019/extlst" xmlns:r="http://schemas.openxmlformats.org/officeDocument/2006/relationships" xmlns:m="http://schemas.openxmlformats.org/officeDocument/2006/math" xmlns:v="urn:schemas-microsoft-com:vml" xmlns:wp14="http://schemas.microsoft.com/office/word/2010/wordprocessingDrawing" xmlns:wp="http://schemas.openxmlformats.org/drawingml/2006/wordprocessingDrawing" xmlns:w10="urn:schemas-microsoft-com:office:word" xmlns:w="http://schemas.openxmlformats.org/wordprocessingml/2006/main" xmlns:w14="http://schemas.microsoft.com/office/word/2010/wordml" xmlns:w15="http://schemas.microsoft.com/office/word/2012/wordml" xmlns:w16cex="http://schemas.microsoft.com/office/word/2018/wordml/cex" xmlns:w16cid="http://schemas.microsoft.com/office/word/2016/wordml/cid" xmlns:w16="http://schemas.microsoft.com/office/word/2018/wordml" xmlns:w16du="http://schemas.microsoft.com/office/word/2023/wordml/word16du" xmlns:w16sdtdh="http://schemas.microsoft.com/office/word/2020/wordml/sdtdatahash" xmlns:w16sdtfl="http://schemas.microsoft.com/office/word/2024/wordml/sdtformatlock" xmlns:w16se="http://schemas.microsoft.com/office/word/2015/wordml/symex" xmlns:wpg="http://schemas.microsoft.com/office/word/2010/wordprocessingGroup" xmlns:wpi="http://schemas.microsoft.com/office/word/2010/wordprocessingInk" xmlns:wne="http://schemas.microsoft.com/office/word/2006/wordml" xmlns:wps="http://schemas.microsoft.com/office/word/2010/wordprocessingShape" mc:Ignorable="w14 w15 w16se w16cid w16 w16cex w16sdtdh w16sdtfl w16du wp14">
+<w:document xmlns:wpc="http://schemas.microsoft.com/office/word/2010/wordprocessingCanvas" xmlns:cx="http://schemas.microsoft.com/office/drawing/2014/chartex" xmlns:cx1="http://schemas.microsoft.com/office/drawing/2015/9/8/chartex" xmlns:cx2="http://schemas.microsoft.com/office/drawing/2015/10/21/chartex" xmlns:cx3="http://schemas.microsoft.com/office/drawing/2016/5/9/chartex" xmlns:cx4="http://schemas.microsoft.com/office/drawing/2016/5/10/chartex" xmlns:cx5="http://schemas.microsoft.com/office/drawing/2016/5/11/chartex" xmlns:cx6="http://schemas.microsoft.com/office/drawing/2016/5/12/chartex" xmlns:cx7="http://schemas.microsoft.com/office/drawing/2016/5/13/chartex" xmlns:cx8="http://schemas.microsoft.com/office/drawing/2016/5/14/chartex" xmlns:mc="http://schemas.openxmlformats.org/markup-compatibility/2006" xmlns:m="http://schemas.openxmlformats.org/officeDocument/2006/math" xmlns:aink="http://schemas.microsoft.com/office/drawing/2016/ink" xmlns:am3d="http://schemas.microsoft.com/office/drawing/2017/model3d" xmlns:oel="http://schemas.microsoft.com/office/2019/extlst" xmlns:r="http://schemas.openxmlformats.org/officeDocument/2006/relationships" xmlns:wp14="http://schemas.microsoft.com/office/word/2010/wordprocessingDrawing" xmlns:wp="http://schemas.openxmlformats.org/drawingml/2006/wordprocessingDrawing" xmlns:wpg="http://schemas.microsoft.com/office/word/2010/wordprocessingGroup" xmlns:wpi="http://schemas.microsoft.com/office/word/2010/wordprocessingInk" xmlns:wps="http://schemas.microsoft.com/office/word/2010/wordprocessingShape" xmlns:o="urn:schemas-microsoft-com:office:office" xmlns:v="urn:schemas-microsoft-com:vml" xmlns:w10="urn:schemas-microsoft-com:office:word" xmlns:w="http://schemas.openxmlformats.org/wordprocessingml/2006/main" xmlns:w14="http://schemas.microsoft.com/office/word/2010/wordml" xmlns:w15="http://schemas.microsoft.com/office/word/2012/wordml" xmlns:w16cex="http://schemas.microsoft.com/office/word/2018/wordml/cex" xmlns:w16cid="http://schemas.microsoft.com/office/word/2016/wordml/cid" xmlns:w16="http://schemas.microsoft.com/office/word/2018/wordml" xmlns:w16sdtdh="http://schemas.microsoft.com/office/word/2020/wordml/sdtdatahash" xmlns:w16sdtfl="http://schemas.microsoft.com/office/word/2024/wordml/sdtformatlock" xmlns:w16se="http://schemas.microsoft.com/office/word/2015/wordml/symex" xmlns:w16du="http://schemas.microsoft.com/office/word/2023/wordml/word16du" xmlns:wne="http://schemas.microsoft.com/office/word/2006/wordml" mc:Ignorable="w14 w15 w16se w16cid w16 w16cex w16sdtdh w16sdtfl w16du wp14">
   <w:body>
     <w:p>
       <w:pPr>
@@ -42,40 +42,6 @@
         </w:rPr>
         <w:t>&lt;&lt;[object.name]&gt;&gt;</w:t>
       </w:r>
-      <w:r>
-        <w:rPr>
-          <w:rFonts w:ascii="Times New Roman" w:hAnsi="Times New Roman"/>
-          <w:i/>
-          <w:sz w:val="20"/>
-          <w:u w:val="single"/>
-          <w:lang w:val="en-US"/>
-        </w:rPr>
-      </w:r>
-      <w:r>
-        <w:rPr>
-          <w:rFonts w:ascii="Times New Roman" w:hAnsi="Times New Roman"/>
-          <w:i/>
-          <w:sz w:val="20"/>
-          <w:u w:val="single"/>
-        </w:rPr>
-      </w:r>
-      <w:r>
-        <w:rPr>
-          <w:rFonts w:ascii="Times New Roman" w:hAnsi="Times New Roman"/>
-          <w:i/>
-          <w:sz w:val="20"/>
-          <w:u w:val="single"/>
-          <w:lang w:val="en-US"/>
-        </w:rPr>
-      </w:r>
-      <w:r>
-        <w:rPr>
-          <w:rFonts w:ascii="Times New Roman" w:hAnsi="Times New Roman"/>
-          <w:i/>
-          <w:sz w:val="20"/>
-          <w:u w:val="single"/>
-        </w:rPr>
-      </w:r>
     </w:p>
     <w:p>
       <w:pPr>
@@ -148,7 +114,7 @@
           <w:sz w:val="20"/>
           <w:lang w:val="en-US"/>
         </w:rPr>
-        <w:t>&lt;&lt;foreach [counterparty in counterparties]&gt;&gt;&lt;&lt;[counterparty.title]&gt;&gt;:</w:t>
+        <w:t>&lt;&lt;foreach [counterparty in counterparties]&gt;&gt;&lt;&lt;[</w:t>
       </w:r>
       <w:proofErr w:type="spellStart"/>
       <w:proofErr w:type="gramStart"/>
@@ -159,6 +125,7 @@
           <w:sz w:val="20"/>
           <w:lang w:val="en-US"/>
         </w:rPr>
+        <w:t>counterparty.title</w:t>
       </w:r>
       <w:proofErr w:type="spellEnd"/>
       <w:proofErr w:type="gramEnd"/>
@@ -169,6 +136,7 @@
           <w:sz w:val="20"/>
           <w:lang w:val="en-US"/>
         </w:rPr>
+        <w:t>]&gt;&gt;:</w:t>
       </w:r>
     </w:p>
     <w:p>
@@ -190,7 +158,7 @@
           <w:u w:val="single"/>
           <w:lang w:val="en-US"/>
         </w:rPr>
-        <w:t>&lt;&lt;[counterparty.displayText]&gt;&gt;</w:t>
+        <w:t>&lt;&lt;[</w:t>
       </w:r>
       <w:proofErr w:type="spellStart"/>
       <w:proofErr w:type="gramStart"/>
@@ -202,6 +170,7 @@
           <w:u w:val="single"/>
           <w:lang w:val="en-US"/>
         </w:rPr>
+        <w:t>counterparty.displayText</w:t>
       </w:r>
       <w:proofErr w:type="spellEnd"/>
       <w:proofErr w:type="gramEnd"/>
@@ -213,6 +182,7 @@
           <w:u w:val="single"/>
           <w:lang w:val="en-US"/>
         </w:rPr>
+        <w:t>]&gt;&gt;</w:t>
       </w:r>
     </w:p>
     <w:p>
@@ -223,27 +193,17 @@
           <w:rFonts w:ascii="Times New Roman" w:hAnsi="Times New Roman"/>
           <w:sz w:val="14"/>
           <w:szCs w:val="16"/>
-          <w:lang w:val="en-US"/>
-        </w:rPr>
-      </w:pPr>
-      <w:r>
-        <w:rPr>
-          <w:rFonts w:ascii="Times New Roman" w:hAnsi="Times New Roman"/>
-          <w:sz w:val="14"/>
-          <w:szCs w:val="16"/>
-          <w:lang w:val="en-US"/>
-        </w:rPr>
-        <w:t>&lt;&lt;if [counterparty.subscript != ""]&gt;&gt;(&lt;&lt;[counterparty.subscript]&gt;&gt;)&lt;&lt;/if&gt;&gt;&lt;&lt;/foreach&gt;&gt;</w:t>
-      </w:r>
-      <w:r>
-        <w:rPr>
-          <w:rFonts w:ascii="Times New Roman" w:hAnsi="Times New Roman"/>
-          <w:sz w:val="14"/>
-          <w:szCs w:val="16"/>
-          <w:lang w:val="en-US"/>
-        </w:rPr>
-      </w:r>
-      <w:proofErr w:type="spellStart"/>
+        </w:rPr>
+      </w:pPr>
+      <w:r>
+        <w:rPr>
+          <w:rFonts w:ascii="Times New Roman" w:hAnsi="Times New Roman"/>
+          <w:sz w:val="14"/>
+          <w:szCs w:val="16"/>
+          <w:lang w:val="en-US"/>
+        </w:rPr>
+        <w:t>&lt;&lt;if [</w:t>
+      </w:r>
       <w:proofErr w:type="gramStart"/>
       <w:r>
         <w:rPr>
@@ -252,8 +212,8 @@
           <w:szCs w:val="16"/>
           <w:lang w:val="en-US"/>
         </w:rPr>
-      </w:r>
-      <w:proofErr w:type="spellEnd"/>
+        <w:t>counterparty.subscript</w:t>
+      </w:r>
       <w:proofErr w:type="gramEnd"/>
       <w:r>
         <w:rPr>
@@ -262,14 +222,83 @@
           <w:szCs w:val="16"/>
           <w:lang w:val="en-US"/>
         </w:rPr>
-      </w:r>
-      <w:r>
-        <w:rPr>
-          <w:rFonts w:ascii="Times New Roman" w:hAnsi="Times New Roman"/>
-          <w:sz w:val="14"/>
-          <w:szCs w:val="16"/>
-          <w:lang w:val="en-US"/>
-        </w:rPr>
+        <w:t xml:space="preserve"> != </w:t>
+      </w:r>
+      <w:r>
+        <w:rPr>
+          <w:rFonts w:ascii="Times New Roman" w:hAnsi="Times New Roman"/>
+          <w:sz w:val="14"/>
+          <w:szCs w:val="16"/>
+        </w:rPr>
+        <w:t>""]&gt;&gt;(&lt;&lt;[</w:t>
+      </w:r>
+      <w:r>
+        <w:rPr>
+          <w:rFonts w:ascii="Times New Roman" w:hAnsi="Times New Roman"/>
+          <w:sz w:val="14"/>
+          <w:szCs w:val="16"/>
+          <w:lang w:val="en-US"/>
+        </w:rPr>
+        <w:t>counterparty</w:t>
+      </w:r>
+      <w:r>
+        <w:rPr>
+          <w:rFonts w:ascii="Times New Roman" w:hAnsi="Times New Roman"/>
+          <w:sz w:val="14"/>
+          <w:szCs w:val="16"/>
+        </w:rPr>
+        <w:t>.</w:t>
+      </w:r>
+      <w:r>
+        <w:rPr>
+          <w:rFonts w:ascii="Times New Roman" w:hAnsi="Times New Roman"/>
+          <w:sz w:val="14"/>
+          <w:szCs w:val="16"/>
+          <w:lang w:val="en-US"/>
+        </w:rPr>
+        <w:t>subscript</w:t>
+      </w:r>
+      <w:r>
+        <w:rPr>
+          <w:rFonts w:ascii="Times New Roman" w:hAnsi="Times New Roman"/>
+          <w:sz w:val="14"/>
+          <w:szCs w:val="16"/>
+        </w:rPr>
+        <w:t>]&gt;&gt;)&lt;&lt;/</w:t>
+      </w:r>
+      <w:r>
+        <w:rPr>
+          <w:rFonts w:ascii="Times New Roman" w:hAnsi="Times New Roman"/>
+          <w:sz w:val="14"/>
+          <w:szCs w:val="16"/>
+          <w:lang w:val="en-US"/>
+        </w:rPr>
+        <w:t>if</w:t>
+      </w:r>
+      <w:r>
+        <w:rPr>
+          <w:rFonts w:ascii="Times New Roman" w:hAnsi="Times New Roman"/>
+          <w:sz w:val="14"/>
+          <w:szCs w:val="16"/>
+        </w:rPr>
+        <w:t>&gt;&gt;&lt;&lt;/</w:t>
+      </w:r>
+      <w:r>
+        <w:rPr>
+          <w:rFonts w:ascii="Times New Roman" w:hAnsi="Times New Roman"/>
+          <w:sz w:val="14"/>
+          <w:szCs w:val="16"/>
+          <w:lang w:val="en-US"/>
+        </w:rPr>
+        <w:t>foreach</w:t>
+      </w:r>
+      <w:r>
+        <w:rPr>
+          <w:rFonts w:ascii="Times New Roman" w:hAnsi="Times New Roman"/>
+          <w:sz w:val="14"/>
+          <w:szCs w:val="16"/>
+        </w:rPr>
+        <w:t>&gt;&gt;</w:t>
       </w:r>
     </w:p>
     <w:p>
@@ -280,7 +309,6 @@
           <w:rFonts w:ascii="Times New Roman" w:hAnsi="Times New Roman"/>
           <w:sz w:val="16"/>
           <w:szCs w:val="16"/>
-          <w:lang w:val="en-US"/>
         </w:rPr>
       </w:pPr>
     </w:p>
@@ -292,7 +320,6 @@
           <w:rFonts w:ascii="Times New Roman" w:hAnsi="Times New Roman"/>
           <w:sz w:val="16"/>
           <w:szCs w:val="16"/>
-          <w:lang w:val="en-US"/>
         </w:rPr>
       </w:pPr>
     </w:p>
@@ -433,7 +460,7 @@
                 <w:u w:val="single"/>
                 <w:lang w:val="en-US"/>
               </w:rPr>
-              <w:t>&lt;&lt;[document.numberLine]&gt;&gt;</w:t>
+              <w:t>&lt;&lt;[</w:t>
             </w:r>
             <w:proofErr w:type="spellStart"/>
             <w:proofErr w:type="gramStart"/>
@@ -446,6 +473,7 @@
                 <w:u w:val="single"/>
                 <w:lang w:val="en-US"/>
               </w:rPr>
+              <w:t>document.numberLine</w:t>
             </w:r>
             <w:proofErr w:type="spellEnd"/>
             <w:proofErr w:type="gramEnd"/>
@@ -458,6 +486,7 @@
                 <w:u w:val="single"/>
                 <w:lang w:val="en-US"/>
               </w:rPr>
+              <w:t>]&gt;&gt;</w:t>
             </w:r>
           </w:p>
         </w:tc>
@@ -491,7 +520,7 @@
                 <w:sz w:val="20"/>
                 <w:lang w:val="en-US"/>
               </w:rPr>
-              <w:t>&lt;&lt;[document.dateLine]&gt;&gt;</w:t>
+              <w:t>&lt;&lt;[</w:t>
             </w:r>
             <w:proofErr w:type="spellStart"/>
             <w:proofErr w:type="gramStart"/>
@@ -503,6 +532,7 @@
                 <w:sz w:val="20"/>
                 <w:lang w:val="en-US"/>
               </w:rPr>
+              <w:t>document.dateLine</w:t>
             </w:r>
             <w:proofErr w:type="spellEnd"/>
             <w:proofErr w:type="gramEnd"/>
@@ -514,6 +544,7 @@
                 <w:sz w:val="20"/>
                 <w:lang w:val="en-US"/>
               </w:rPr>
+              <w:t>]&gt;&gt;</w:t>
             </w:r>
           </w:p>
         </w:tc>
@@ -564,7 +595,7 @@
           <w:sz w:val="20"/>
           <w:lang w:val="en-US"/>
         </w:rPr>
-        <w:t>&lt;&lt;foreach [group in representatives.groups]&gt;&gt;&lt;&lt;[group.title]&gt;&gt;:</w:t>
+        <w:t xml:space="preserve">&lt;&lt;foreach [group in </w:t>
       </w:r>
       <w:proofErr w:type="spellStart"/>
       <w:proofErr w:type="gramStart"/>
@@ -575,6 +606,7 @@
           <w:sz w:val="20"/>
           <w:lang w:val="en-US"/>
         </w:rPr>
+        <w:t>representatives.groups</w:t>
       </w:r>
       <w:proofErr w:type="spellEnd"/>
       <w:proofErr w:type="gramEnd"/>
@@ -585,100 +617,52 @@
           <w:sz w:val="20"/>
           <w:lang w:val="en-US"/>
         </w:rPr>
-      </w:r>
-    </w:p>
-    <w:p>
-      <w:pPr>
-        <w:spacing w:after="0" w:line="240" w:lineRule="auto"/>
-        <w:jc w:val="both"/>
-        <w:rPr>
-          <w:rFonts w:ascii="Times New Roman" w:hAnsi="Times New Roman"/>
-          <w:i/>
-          <w:sz w:val="20"/>
-          <w:u w:val="single"/>
-          <w:lang w:val="en-US"/>
-        </w:rPr>
-      </w:pPr>
-      <w:r>
-        <w:rPr>
-          <w:rFonts w:ascii="Times New Roman" w:hAnsi="Times New Roman"/>
-          <w:i/>
-          <w:sz w:val="20"/>
-          <w:u w:val="single"/>
-          <w:lang w:val="en-US"/>
-        </w:rPr>
-        <w:t>&lt;&lt;foreach [member in group.members]&gt;&gt;&lt;&lt;[member.introDisplayText]&gt;&gt;</w:t>
-      </w:r>
-      <w:proofErr w:type="spellStart"/>
-      <w:r>
-        <w:rPr>
-          <w:rFonts w:ascii="Times New Roman" w:hAnsi="Times New Roman"/>
-          <w:i/>
-          <w:sz w:val="20"/>
-          <w:u w:val="single"/>
-          <w:lang w:val="en-US"/>
-        </w:rPr>
-      </w:r>
-      <w:proofErr w:type="spellEnd"/>
-      <w:r>
-        <w:rPr>
-          <w:rFonts w:ascii="Times New Roman" w:hAnsi="Times New Roman"/>
-          <w:i/>
-          <w:sz w:val="20"/>
-          <w:u w:val="single"/>
-          <w:lang w:val="en-US"/>
-        </w:rPr>
+        <w:t>]&gt;&gt;&lt;&lt;[</w:t>
       </w:r>
       <w:proofErr w:type="spellStart"/>
       <w:proofErr w:type="gramStart"/>
       <w:r>
         <w:rPr>
           <w:rFonts w:ascii="Times New Roman" w:hAnsi="Times New Roman"/>
-          <w:i/>
-          <w:sz w:val="20"/>
-          <w:u w:val="single"/>
-          <w:lang w:val="en-US"/>
-        </w:rPr>
+          <w:b/>
+          <w:sz w:val="20"/>
+          <w:lang w:val="en-US"/>
+        </w:rPr>
+        <w:t>group.title</w:t>
       </w:r>
       <w:proofErr w:type="spellEnd"/>
-      <w:r>
-        <w:rPr>
-          <w:rFonts w:ascii="Times New Roman" w:hAnsi="Times New Roman"/>
-          <w:i/>
-          <w:sz w:val="20"/>
-          <w:u w:val="single"/>
-          <w:lang w:val="en-US"/>
-        </w:rPr>
-      </w:r>
       <w:proofErr w:type="gramEnd"/>
       <w:r>
         <w:rPr>
           <w:rFonts w:ascii="Times New Roman" w:hAnsi="Times New Roman"/>
-          <w:i/>
-          <w:sz w:val="20"/>
-          <w:u w:val="single"/>
-          <w:lang w:val="en-US"/>
-        </w:rPr>
-      </w:r>
-      <w:proofErr w:type="spellStart"/>
-      <w:r>
-        <w:rPr>
-          <w:rFonts w:ascii="Times New Roman" w:hAnsi="Times New Roman"/>
-          <w:i/>
-          <w:sz w:val="20"/>
-          <w:u w:val="single"/>
-          <w:lang w:val="en-US"/>
-        </w:rPr>
-      </w:r>
-      <w:proofErr w:type="spellEnd"/>
-      <w:r>
-        <w:rPr>
-          <w:rFonts w:ascii="Times New Roman" w:hAnsi="Times New Roman"/>
-          <w:i/>
-          <w:sz w:val="20"/>
-          <w:u w:val="single"/>
-          <w:lang w:val="en-US"/>
-        </w:rPr>
+          <w:b/>
+          <w:sz w:val="20"/>
+          <w:lang w:val="en-US"/>
+        </w:rPr>
+        <w:t>]&gt;&gt;:</w:t>
+      </w:r>
+    </w:p>
+    <w:p>
+      <w:pPr>
+        <w:spacing w:after="0" w:line="240" w:lineRule="auto"/>
+        <w:jc w:val="both"/>
+        <w:rPr>
+          <w:rFonts w:ascii="Times New Roman" w:hAnsi="Times New Roman"/>
+          <w:i/>
+          <w:sz w:val="20"/>
+          <w:u w:val="single"/>
+          <w:lang w:val="en-US"/>
+        </w:rPr>
+      </w:pPr>
+      <w:r>
+        <w:rPr>
+          <w:rFonts w:ascii="Times New Roman" w:hAnsi="Times New Roman"/>
+          <w:i/>
+          <w:sz w:val="20"/>
+          <w:u w:val="single"/>
+          <w:lang w:val="en-US"/>
+        </w:rPr>
+        <w:t xml:space="preserve">&lt;&lt;foreach [member in </w:t>
       </w:r>
       <w:proofErr w:type="spellStart"/>
       <w:proofErr w:type="gramStart"/>
@@ -690,235 +674,7 @@
           <w:u w:val="single"/>
           <w:lang w:val="en-US"/>
         </w:rPr>
-      </w:r>
-      <w:proofErr w:type="spellEnd"/>
-      <w:r>
-        <w:rPr>
-          <w:rFonts w:ascii="Times New Roman" w:hAnsi="Times New Roman"/>
-          <w:i/>
-          <w:sz w:val="20"/>
-          <w:u w:val="single"/>
-          <w:lang w:val="en-US"/>
-        </w:rPr>
-      </w:r>
-      <w:proofErr w:type="gramEnd"/>
-      <w:r>
-        <w:rPr>
-          <w:rFonts w:ascii="Times New Roman" w:hAnsi="Times New Roman"/>
-          <w:i/>
-          <w:sz w:val="20"/>
-          <w:u w:val="single"/>
-          <w:lang w:val="en-US"/>
-        </w:rPr>
-      </w:r>
-      <w:proofErr w:type="spellStart"/>
-      <w:r>
-        <w:rPr>
-          <w:rFonts w:ascii="Times New Roman" w:hAnsi="Times New Roman"/>
-          <w:i/>
-          <w:sz w:val="20"/>
-          <w:u w:val="single"/>
-          <w:lang w:val="en-US"/>
-        </w:rPr>
-      </w:r>
-      <w:proofErr w:type="spellEnd"/>
-      <w:r>
-        <w:rPr>
-          <w:rFonts w:ascii="Times New Roman" w:hAnsi="Times New Roman"/>
-          <w:i/>
-          <w:sz w:val="20"/>
-          <w:u w:val="single"/>
-          <w:lang w:val="en-US"/>
-        </w:rPr>
-      </w:r>
-    </w:p>
-    <w:p>
-      <w:pPr>
-        <w:spacing w:after="0" w:line="240" w:lineRule="auto"/>
-        <w:jc w:val="center"/>
-        <w:rPr>
-          <w:rFonts w:ascii="Times New Roman" w:hAnsi="Times New Roman"/>
-          <w:i/>
-          <w:sz w:val="14"/>
-          <w:szCs w:val="16"/>
-          <w:lang w:val="en-US"/>
-        </w:rPr>
-      </w:pPr>
-      <w:r>
-        <w:rPr>
-          <w:rFonts w:ascii="Times New Roman" w:hAnsi="Times New Roman"/>
-          <w:i/>
-          <w:sz w:val="14"/>
-          <w:szCs w:val="16"/>
-          <w:lang w:val="en-US"/>
-        </w:rPr>
-        <w:t>&lt;&lt;if [member.subscript != ""]&gt;&gt;(&lt;&lt;[member.subscript]&gt;&gt;)&lt;&lt;/if&gt;&gt;</w:t>
-      </w:r>
-      <w:proofErr w:type="gramStart"/>
-      <w:r>
-        <w:rPr>
-          <w:rFonts w:ascii="Times New Roman" w:hAnsi="Times New Roman"/>
-          <w:i/>
-          <w:sz w:val="14"/>
-          <w:szCs w:val="16"/>
-          <w:lang w:val="en-US"/>
-        </w:rPr>
-      </w:r>
-      <w:proofErr w:type="gramEnd"/>
-      <w:r>
-        <w:rPr>
-          <w:rFonts w:ascii="Times New Roman" w:hAnsi="Times New Roman"/>
-          <w:i/>
-          <w:sz w:val="14"/>
-          <w:szCs w:val="16"/>
-          <w:lang w:val="en-US"/>
-        </w:rPr>
-      </w:r>
-      <w:proofErr w:type="gramStart"/>
-      <w:r>
-        <w:rPr>
-          <w:rFonts w:ascii="Times New Roman" w:hAnsi="Times New Roman"/>
-          <w:i/>
-          <w:sz w:val="14"/>
-          <w:szCs w:val="16"/>
-          <w:lang w:val="en-US"/>
-        </w:rPr>
-      </w:r>
-      <w:proofErr w:type="gramEnd"/>
-      <w:r>
-        <w:rPr>
-          <w:rFonts w:ascii="Times New Roman" w:hAnsi="Times New Roman"/>
-          <w:i/>
-          <w:sz w:val="14"/>
-          <w:szCs w:val="16"/>
-          <w:lang w:val="en-US"/>
-        </w:rPr>
-      </w:r>
-    </w:p>
-    <w:p>
-      <w:pPr>
-        <w:spacing w:after="0" w:line="240" w:lineRule="auto"/>
-        <w:jc w:val="center"/>
-        <w:rPr>
-          <w:rFonts w:ascii="Times New Roman" w:hAnsi="Times New Roman"/>
-          <w:i/>
-          <w:sz w:val="14"/>
-          <w:szCs w:val="16"/>
-          <w:lang w:val="en-US"/>
-        </w:rPr>
-      </w:pPr>
-      <w:r>
-        <w:rPr>
-          <w:rFonts w:ascii="Times New Roman" w:hAnsi="Times New Roman"/>
-          <w:i/>
-          <w:sz w:val="14"/>
-          <w:szCs w:val="16"/>
-          <w:lang w:val="en-US"/>
-        </w:rPr>
-        <w:t>&lt;&lt;/foreach&gt;&gt;&lt;&lt;/foreach&gt;&gt;</w:t>
-      </w:r>
-    </w:p>
-    <w:p>
-      <w:pPr>
-        <w:spacing w:after="0" w:line="240" w:lineRule="auto"/>
-        <w:jc w:val="both"/>
-        <w:rPr>
-          <w:rFonts w:ascii="Times New Roman" w:hAnsi="Times New Roman"/>
-          <w:sz w:val="20"/>
-        </w:rPr>
-      </w:pPr>
-      <w:r>
-        <w:rPr>
-          <w:rFonts w:ascii="Times New Roman" w:hAnsi="Times New Roman"/>
-          <w:sz w:val="20"/>
-        </w:rPr>
-        <w:t>произвели</w:t>
-      </w:r>
-      <w:r>
-        <w:rPr>
-          <w:rFonts w:ascii="Times New Roman" w:hAnsi="Times New Roman"/>
-          <w:sz w:val="20"/>
-        </w:rPr>
-        <w:t xml:space="preserve"> </w:t>
-      </w:r>
-      <w:r>
-        <w:rPr>
-          <w:rFonts w:ascii="Times New Roman" w:hAnsi="Times New Roman"/>
-          <w:sz w:val="20"/>
-        </w:rPr>
-        <w:t>осмотр</w:t>
-      </w:r>
-      <w:r>
-        <w:rPr>
-          <w:rFonts w:ascii="Times New Roman" w:hAnsi="Times New Roman"/>
-          <w:sz w:val="20"/>
-        </w:rPr>
-        <w:t xml:space="preserve"> </w:t>
-      </w:r>
-      <w:r>
-        <w:rPr>
-          <w:rFonts w:ascii="Times New Roman" w:hAnsi="Times New Roman"/>
-          <w:sz w:val="20"/>
-        </w:rPr>
-        <w:t>работ</w:t>
-      </w:r>
-      <w:r>
-        <w:rPr>
-          <w:rFonts w:ascii="Times New Roman" w:hAnsi="Times New Roman"/>
-          <w:sz w:val="20"/>
-        </w:rPr>
-        <w:t xml:space="preserve">, </w:t>
-      </w:r>
-      <w:r>
-        <w:rPr>
-          <w:rFonts w:ascii="Times New Roman" w:hAnsi="Times New Roman"/>
-          <w:sz w:val="20"/>
-        </w:rPr>
-        <w:t>выполненных</w:t>
-      </w:r>
-      <w:r>
-        <w:rPr>
-          <w:rFonts w:ascii="Times New Roman" w:hAnsi="Times New Roman"/>
-          <w:sz w:val="20"/>
-        </w:rPr>
-        <w:t xml:space="preserve"> </w:t>
-      </w:r>
-      <w:r>
-        <w:rPr>
-          <w:rFonts w:ascii="Times New Roman" w:hAnsi="Times New Roman"/>
-          <w:i/>
-          <w:sz w:val="20"/>
-          <w:u w:val="single"/>
-        </w:rPr>
-        <w:t>&lt;&lt;[work.contractorName]&gt;&gt;</w:t>
-      </w:r>
-      <w:proofErr w:type="gramStart"/>
-      <w:r>
-        <w:rPr>
-          <w:rFonts w:ascii="Times New Roman" w:hAnsi="Times New Roman"/>
-          <w:i/>
-          <w:sz w:val="20"/>
-          <w:u w:val="single"/>
-          <w:lang w:val="en-US"/>
-        </w:rPr>
-      </w:r>
-      <w:r>
-        <w:rPr>
-          <w:rFonts w:ascii="Times New Roman" w:hAnsi="Times New Roman"/>
-          <w:i/>
-          <w:sz w:val="20"/>
-          <w:u w:val="single"/>
-        </w:rPr>
-      </w:r>
-      <w:proofErr w:type="spellStart"/>
-      <w:r>
-        <w:rPr>
-          <w:rFonts w:ascii="Times New Roman" w:hAnsi="Times New Roman"/>
-          <w:i/>
-          <w:sz w:val="20"/>
-          <w:u w:val="single"/>
-          <w:lang w:val="en-US"/>
-        </w:rPr>
+        <w:t>group.members</w:t>
       </w:r>
       <w:proofErr w:type="spellEnd"/>
       <w:proofErr w:type="gramEnd"/>
@@ -928,129 +684,33 @@
           <w:i/>
           <w:sz w:val="20"/>
           <w:u w:val="single"/>
-        </w:rPr>
-      </w:r>
-    </w:p>
-    <w:p>
-      <w:pPr>
-        <w:spacing w:after="0" w:line="240" w:lineRule="auto"/>
-        <w:jc w:val="center"/>
-        <w:rPr>
-          <w:rFonts w:ascii="Times New Roman" w:hAnsi="Times New Roman"/>
-          <w:i/>
-          <w:sz w:val="14"/>
-          <w:szCs w:val="16"/>
-        </w:rPr>
-      </w:pPr>
-      <w:r>
-        <w:rPr>
-          <w:rFonts w:ascii="Times New Roman" w:hAnsi="Times New Roman"/>
-          <w:i/>
-          <w:sz w:val="14"/>
-          <w:szCs w:val="16"/>
-        </w:rPr>
-        <w:t>(</w:t>
-      </w:r>
-      <w:r>
-        <w:rPr>
-          <w:rFonts w:ascii="Times New Roman" w:hAnsi="Times New Roman"/>
-          <w:i/>
-          <w:sz w:val="14"/>
-          <w:szCs w:val="16"/>
-        </w:rPr>
-        <w:t>полное и (или) сокращенное наименование или фамилия, имя, отчество (последнее – при наличии) лица, выполнившего работы, подлежащие освидетельствованию</w:t>
-      </w:r>
-      <w:r>
-        <w:rPr>
-          <w:rFonts w:ascii="Times New Roman" w:hAnsi="Times New Roman"/>
-          <w:i/>
-          <w:sz w:val="14"/>
-          <w:szCs w:val="16"/>
-        </w:rPr>
-        <w:t>)</w:t>
-      </w:r>
-    </w:p>
-    <w:p>
-      <w:pPr>
-        <w:spacing w:after="0" w:line="240" w:lineRule="auto"/>
-        <w:jc w:val="both"/>
-        <w:rPr>
-          <w:rFonts w:ascii="Times New Roman" w:hAnsi="Times New Roman"/>
-          <w:sz w:val="20"/>
-        </w:rPr>
-      </w:pPr>
-      <w:r>
-        <w:rPr>
-          <w:rFonts w:ascii="Times New Roman" w:hAnsi="Times New Roman"/>
-          <w:sz w:val="20"/>
-        </w:rPr>
-        <w:t>и составили настоящий акт о нижеследующем:</w:t>
-      </w:r>
-    </w:p>
-    <w:p>
-      <w:pPr>
-        <w:spacing w:after="0" w:line="240" w:lineRule="auto"/>
-        <w:jc w:val="both"/>
-        <w:rPr>
-          <w:rFonts w:ascii="Times New Roman" w:hAnsi="Times New Roman"/>
-          <w:i/>
-          <w:sz w:val="14"/>
-          <w:szCs w:val="16"/>
-        </w:rPr>
-      </w:pPr>
-      <w:r>
-        <w:rPr>
-          <w:rFonts w:ascii="Times New Roman" w:hAnsi="Times New Roman"/>
-          <w:sz w:val="20"/>
-        </w:rPr>
-        <w:t>1.</w:t>
-      </w:r>
-      <w:r>
-        <w:rPr>
-          <w:rFonts w:ascii="Times New Roman" w:hAnsi="Times New Roman"/>
-          <w:sz w:val="20"/>
-        </w:rPr>
-        <w:tab/>
-      </w:r>
-      <w:r>
-        <w:rPr>
-          <w:rFonts w:ascii="Times New Roman" w:hAnsi="Times New Roman"/>
-          <w:sz w:val="20"/>
-        </w:rPr>
-        <w:t>К освидетельствованию предъявлены следующие работы:</w:t>
-      </w:r>
-      <w:r>
-        <w:rPr>
-          <w:rFonts w:ascii="Times New Roman" w:hAnsi="Times New Roman"/>
-          <w:sz w:val="20"/>
-        </w:rPr>
-        <w:t xml:space="preserve"> </w:t>
-      </w:r>
-      <w:r>
-        <w:rPr>
-          <w:rFonts w:ascii="Times New Roman" w:hAnsi="Times New Roman"/>
-          <w:sz w:val="20"/>
-          <w:u w:val="single"/>
-        </w:rPr>
-        <w:t>&lt;&lt;[work.description]&gt;&gt;</w:t>
+          <w:lang w:val="en-US"/>
+        </w:rPr>
+        <w:t>]&gt;&gt;&lt;&lt;[</w:t>
       </w:r>
       <w:proofErr w:type="spellStart"/>
       <w:proofErr w:type="gramStart"/>
       <w:r>
         <w:rPr>
           <w:rFonts w:ascii="Times New Roman" w:hAnsi="Times New Roman"/>
-          <w:sz w:val="20"/>
-          <w:u w:val="single"/>
-        </w:rPr>
+          <w:i/>
+          <w:sz w:val="20"/>
+          <w:u w:val="single"/>
+          <w:lang w:val="en-US"/>
+        </w:rPr>
+        <w:t>member.introDisplayText</w:t>
       </w:r>
       <w:proofErr w:type="spellEnd"/>
       <w:proofErr w:type="gramEnd"/>
       <w:r>
         <w:rPr>
           <w:rFonts w:ascii="Times New Roman" w:hAnsi="Times New Roman"/>
-          <w:sz w:val="20"/>
-          <w:u w:val="single"/>
-        </w:rPr>
+          <w:i/>
+          <w:sz w:val="20"/>
+          <w:u w:val="single"/>
+          <w:lang w:val="en-US"/>
+        </w:rPr>
+        <w:t>]&gt;&gt;</w:t>
       </w:r>
     </w:p>
     <w:p>
@@ -1062,16 +722,107 @@
           <w:i/>
           <w:sz w:val="14"/>
           <w:szCs w:val="16"/>
-        </w:rPr>
-      </w:pPr>
-      <w:r>
-        <w:rPr>
-          <w:rFonts w:ascii="Times New Roman" w:hAnsi="Times New Roman"/>
-          <w:i/>
-          <w:sz w:val="14"/>
-          <w:szCs w:val="16"/>
-        </w:rPr>
-        <w:t>(наименование скрытых работ)</w:t>
+          <w:lang w:val="en-US"/>
+        </w:rPr>
+      </w:pPr>
+      <w:r>
+        <w:rPr>
+          <w:rFonts w:ascii="Times New Roman" w:hAnsi="Times New Roman"/>
+          <w:i/>
+          <w:sz w:val="14"/>
+          <w:szCs w:val="16"/>
+          <w:lang w:val="en-US"/>
+        </w:rPr>
+        <w:t>&lt;&lt;if [</w:t>
+      </w:r>
+      <w:proofErr w:type="gramStart"/>
+      <w:r>
+        <w:rPr>
+          <w:rFonts w:ascii="Times New Roman" w:hAnsi="Times New Roman"/>
+          <w:i/>
+          <w:sz w:val="14"/>
+          <w:szCs w:val="16"/>
+          <w:lang w:val="en-US"/>
+        </w:rPr>
+        <w:t>member.subscript !=</w:t>
+      </w:r>
+      <w:proofErr w:type="gramEnd"/>
+      <w:r>
+        <w:rPr>
+          <w:rFonts w:ascii="Times New Roman" w:hAnsi="Times New Roman"/>
+          <w:i/>
+          <w:sz w:val="14"/>
+          <w:szCs w:val="16"/>
+          <w:lang w:val="en-US"/>
+        </w:rPr>
+        <w:t xml:space="preserve"> ""]&gt;&gt;(&lt;&lt;[</w:t>
+      </w:r>
+      <w:proofErr w:type="gramStart"/>
+      <w:r>
+        <w:rPr>
+          <w:rFonts w:ascii="Times New Roman" w:hAnsi="Times New Roman"/>
+          <w:i/>
+          <w:sz w:val="14"/>
+          <w:szCs w:val="16"/>
+          <w:lang w:val="en-US"/>
+        </w:rPr>
+        <w:t>member.subscript</w:t>
+      </w:r>
+      <w:proofErr w:type="gramEnd"/>
+      <w:r>
+        <w:rPr>
+          <w:rFonts w:ascii="Times New Roman" w:hAnsi="Times New Roman"/>
+          <w:i/>
+          <w:sz w:val="14"/>
+          <w:szCs w:val="16"/>
+          <w:lang w:val="en-US"/>
+        </w:rPr>
+        <w:t>]&gt;</w:t>
+      </w:r>
+      <w:proofErr w:type="gramStart"/>
+      <w:r>
+        <w:rPr>
+          <w:rFonts w:ascii="Times New Roman" w:hAnsi="Times New Roman"/>
+          <w:i/>
+          <w:sz w:val="14"/>
+          <w:szCs w:val="16"/>
+          <w:lang w:val="en-US"/>
+        </w:rPr>
+        <w:t>&gt;)&lt;</w:t>
+      </w:r>
+      <w:proofErr w:type="gramEnd"/>
+      <w:r>
+        <w:rPr>
+          <w:rFonts w:ascii="Times New Roman" w:hAnsi="Times New Roman"/>
+          <w:i/>
+          <w:sz w:val="14"/>
+          <w:szCs w:val="16"/>
+          <w:lang w:val="en-US"/>
+        </w:rPr>
+        <w:t>&lt;/if&gt;&gt;</w:t>
+      </w:r>
+    </w:p>
+    <w:p>
+      <w:pPr>
+        <w:spacing w:after="0" w:line="240" w:lineRule="auto"/>
+        <w:jc w:val="center"/>
+        <w:rPr>
+          <w:rFonts w:ascii="Times New Roman" w:hAnsi="Times New Roman"/>
+          <w:i/>
+          <w:sz w:val="14"/>
+          <w:szCs w:val="16"/>
+          <w:lang w:val="en-US"/>
+        </w:rPr>
+      </w:pPr>
+      <w:r>
+        <w:rPr>
+          <w:rFonts w:ascii="Times New Roman" w:hAnsi="Times New Roman"/>
+          <w:i/>
+          <w:sz w:val="14"/>
+          <w:szCs w:val="16"/>
+          <w:lang w:val="en-US"/>
+        </w:rPr>
+        <w:t>&lt;&lt;/foreach&gt;&gt;&lt;&lt;/foreach&gt;&gt;</w:t>
       </w:r>
     </w:p>
     <w:p>
@@ -1088,38 +839,65 @@
           <w:rFonts w:ascii="Times New Roman" w:hAnsi="Times New Roman"/>
           <w:sz w:val="20"/>
         </w:rPr>
-        <w:t>2.</w:t>
-      </w:r>
-      <w:r>
-        <w:rPr>
-          <w:rFonts w:ascii="Times New Roman" w:hAnsi="Times New Roman"/>
-          <w:sz w:val="20"/>
-        </w:rPr>
-        <w:tab/>
-      </w:r>
-      <w:r>
-        <w:rPr>
-          <w:rFonts w:ascii="Times New Roman" w:hAnsi="Times New Roman"/>
-          <w:sz w:val="20"/>
-        </w:rPr>
-        <w:t xml:space="preserve">Работы выполнены по проектной документации: </w:t>
-      </w:r>
-      <w:r>
-        <w:rPr>
-          <w:rFonts w:ascii="Times New Roman" w:hAnsi="Times New Roman"/>
-          <w:i/>
-          <w:sz w:val="20"/>
-          <w:u w:val="single"/>
-        </w:rPr>
-        <w:t>&lt;&lt;[project.documentation]&gt;&gt;</w:t>
-      </w:r>
-      <w:r>
-        <w:rPr>
-          <w:rFonts w:ascii="Times New Roman" w:hAnsi="Times New Roman"/>
-          <w:i/>
-          <w:sz w:val="20"/>
-          <w:u w:val="single"/>
-        </w:rPr>
+        <w:t>произвели</w:t>
+      </w:r>
+      <w:r>
+        <w:rPr>
+          <w:rFonts w:ascii="Times New Roman" w:hAnsi="Times New Roman"/>
+          <w:sz w:val="20"/>
+        </w:rPr>
+        <w:t xml:space="preserve"> </w:t>
+      </w:r>
+      <w:r>
+        <w:rPr>
+          <w:rFonts w:ascii="Times New Roman" w:hAnsi="Times New Roman"/>
+          <w:sz w:val="20"/>
+        </w:rPr>
+        <w:t>осмотр</w:t>
+      </w:r>
+      <w:r>
+        <w:rPr>
+          <w:rFonts w:ascii="Times New Roman" w:hAnsi="Times New Roman"/>
+          <w:sz w:val="20"/>
+        </w:rPr>
+        <w:t xml:space="preserve"> </w:t>
+      </w:r>
+      <w:r>
+        <w:rPr>
+          <w:rFonts w:ascii="Times New Roman" w:hAnsi="Times New Roman"/>
+          <w:sz w:val="20"/>
+        </w:rPr>
+        <w:t>работ</w:t>
+      </w:r>
+      <w:r>
+        <w:rPr>
+          <w:rFonts w:ascii="Times New Roman" w:hAnsi="Times New Roman"/>
+          <w:sz w:val="20"/>
+        </w:rPr>
+        <w:t xml:space="preserve">, </w:t>
+      </w:r>
+      <w:r>
+        <w:rPr>
+          <w:rFonts w:ascii="Times New Roman" w:hAnsi="Times New Roman"/>
+          <w:sz w:val="20"/>
+        </w:rPr>
+        <w:t>выполненных</w:t>
+      </w:r>
+      <w:r>
+        <w:rPr>
+          <w:rFonts w:ascii="Times New Roman" w:hAnsi="Times New Roman"/>
+          <w:sz w:val="20"/>
+        </w:rPr>
+        <w:t xml:space="preserve"> </w:t>
+      </w:r>
+      <w:r>
+        <w:rPr>
+          <w:rFonts w:ascii="Times New Roman" w:hAnsi="Times New Roman"/>
+          <w:i/>
+          <w:sz w:val="20"/>
+          <w:u w:val="single"/>
+        </w:rPr>
+        <w:t>&lt;&lt;[</w:t>
       </w:r>
       <w:proofErr w:type="spellStart"/>
       <w:proofErr w:type="gramStart"/>
@@ -1130,6 +908,7 @@
           <w:sz w:val="20"/>
           <w:u w:val="single"/>
         </w:rPr>
+        <w:t>work.contractorName</w:t>
       </w:r>
       <w:proofErr w:type="spellEnd"/>
       <w:proofErr w:type="gramEnd"/>
@@ -1140,6 +919,7 @@
           <w:sz w:val="20"/>
           <w:u w:val="single"/>
         </w:rPr>
+        <w:t>]&gt;&gt;</w:t>
       </w:r>
     </w:p>
     <w:p>
@@ -1160,6 +940,219 @@
           <w:sz w:val="14"/>
           <w:szCs w:val="16"/>
         </w:rPr>
+        <w:t>(</w:t>
+      </w:r>
+      <w:r>
+        <w:rPr>
+          <w:rFonts w:ascii="Times New Roman" w:hAnsi="Times New Roman"/>
+          <w:i/>
+          <w:sz w:val="14"/>
+          <w:szCs w:val="16"/>
+        </w:rPr>
+        <w:t>полное и (или) сокращенное наименование или фамилия, имя, отчество (последнее – при наличии) лица, выполнившего работы, подлежащие освидетельствованию</w:t>
+      </w:r>
+      <w:r>
+        <w:rPr>
+          <w:rFonts w:ascii="Times New Roman" w:hAnsi="Times New Roman"/>
+          <w:i/>
+          <w:sz w:val="14"/>
+          <w:szCs w:val="16"/>
+        </w:rPr>
+        <w:t>)</w:t>
+      </w:r>
+    </w:p>
+    <w:p>
+      <w:pPr>
+        <w:spacing w:after="0" w:line="240" w:lineRule="auto"/>
+        <w:jc w:val="both"/>
+        <w:rPr>
+          <w:rFonts w:ascii="Times New Roman" w:hAnsi="Times New Roman"/>
+          <w:sz w:val="20"/>
+        </w:rPr>
+      </w:pPr>
+      <w:r>
+        <w:rPr>
+          <w:rFonts w:ascii="Times New Roman" w:hAnsi="Times New Roman"/>
+          <w:sz w:val="20"/>
+        </w:rPr>
+        <w:t>и составили настоящий акт о нижеследующем:</w:t>
+      </w:r>
+    </w:p>
+    <w:p>
+      <w:pPr>
+        <w:spacing w:after="0" w:line="240" w:lineRule="auto"/>
+        <w:jc w:val="both"/>
+        <w:rPr>
+          <w:rFonts w:ascii="Times New Roman" w:hAnsi="Times New Roman"/>
+          <w:i/>
+          <w:sz w:val="14"/>
+          <w:szCs w:val="16"/>
+        </w:rPr>
+      </w:pPr>
+      <w:r>
+        <w:rPr>
+          <w:rFonts w:ascii="Times New Roman" w:hAnsi="Times New Roman"/>
+          <w:sz w:val="20"/>
+        </w:rPr>
+        <w:t>1.</w:t>
+      </w:r>
+      <w:r>
+        <w:rPr>
+          <w:rFonts w:ascii="Times New Roman" w:hAnsi="Times New Roman"/>
+          <w:sz w:val="20"/>
+        </w:rPr>
+        <w:tab/>
+      </w:r>
+      <w:r>
+        <w:rPr>
+          <w:rFonts w:ascii="Times New Roman" w:hAnsi="Times New Roman"/>
+          <w:sz w:val="20"/>
+        </w:rPr>
+        <w:t>К освидетельствованию предъявлены следующие работы:</w:t>
+      </w:r>
+      <w:r>
+        <w:rPr>
+          <w:rFonts w:ascii="Times New Roman" w:hAnsi="Times New Roman"/>
+          <w:sz w:val="20"/>
+        </w:rPr>
+        <w:t xml:space="preserve"> </w:t>
+      </w:r>
+      <w:r>
+        <w:rPr>
+          <w:rFonts w:ascii="Times New Roman" w:hAnsi="Times New Roman"/>
+          <w:i/>
+          <w:iCs/>
+          <w:sz w:val="20"/>
+          <w:u w:val="single"/>
+        </w:rPr>
+        <w:t>&lt;&lt;[</w:t>
+      </w:r>
+      <w:proofErr w:type="spellStart"/>
+      <w:proofErr w:type="gramStart"/>
+      <w:r>
+        <w:rPr>
+          <w:rFonts w:ascii="Times New Roman" w:hAnsi="Times New Roman"/>
+          <w:i/>
+          <w:iCs/>
+          <w:sz w:val="20"/>
+          <w:u w:val="single"/>
+        </w:rPr>
+        <w:t>work.description</w:t>
+      </w:r>
+      <w:proofErr w:type="spellEnd"/>
+      <w:proofErr w:type="gramEnd"/>
+      <w:r>
+        <w:rPr>
+          <w:rFonts w:ascii="Times New Roman" w:hAnsi="Times New Roman"/>
+          <w:i/>
+          <w:iCs/>
+          <w:sz w:val="20"/>
+          <w:u w:val="single"/>
+        </w:rPr>
+        <w:t>]&gt;&gt;</w:t>
+      </w:r>
+    </w:p>
+    <w:p>
+      <w:pPr>
+        <w:spacing w:after="0" w:line="240" w:lineRule="auto"/>
+        <w:jc w:val="center"/>
+        <w:rPr>
+          <w:rFonts w:ascii="Times New Roman" w:hAnsi="Times New Roman"/>
+          <w:i/>
+          <w:sz w:val="14"/>
+          <w:szCs w:val="16"/>
+        </w:rPr>
+      </w:pPr>
+      <w:r>
+        <w:rPr>
+          <w:rFonts w:ascii="Times New Roman" w:hAnsi="Times New Roman"/>
+          <w:i/>
+          <w:sz w:val="14"/>
+          <w:szCs w:val="16"/>
+        </w:rPr>
+        <w:t>(наименование скрытых работ)</w:t>
+      </w:r>
+    </w:p>
+    <w:p>
+      <w:pPr>
+        <w:spacing w:after="0" w:line="240" w:lineRule="auto"/>
+        <w:jc w:val="both"/>
+        <w:rPr>
+          <w:rFonts w:ascii="Times New Roman" w:hAnsi="Times New Roman"/>
+          <w:sz w:val="20"/>
+        </w:rPr>
+      </w:pPr>
+      <w:r>
+        <w:rPr>
+          <w:rFonts w:ascii="Times New Roman" w:hAnsi="Times New Roman"/>
+          <w:sz w:val="20"/>
+        </w:rPr>
+        <w:t>2.</w:t>
+      </w:r>
+      <w:r>
+        <w:rPr>
+          <w:rFonts w:ascii="Times New Roman" w:hAnsi="Times New Roman"/>
+          <w:sz w:val="20"/>
+        </w:rPr>
+        <w:tab/>
+      </w:r>
+      <w:r>
+        <w:rPr>
+          <w:rFonts w:ascii="Times New Roman" w:hAnsi="Times New Roman"/>
+          <w:sz w:val="20"/>
+        </w:rPr>
+        <w:t xml:space="preserve">Работы выполнены по проектной документации: </w:t>
+      </w:r>
+      <w:r>
+        <w:rPr>
+          <w:rFonts w:ascii="Times New Roman" w:hAnsi="Times New Roman"/>
+          <w:i/>
+          <w:sz w:val="20"/>
+          <w:u w:val="single"/>
+        </w:rPr>
+        <w:t>&lt;&lt;[</w:t>
+      </w:r>
+      <w:proofErr w:type="spellStart"/>
+      <w:proofErr w:type="gramStart"/>
+      <w:r>
+        <w:rPr>
+          <w:rFonts w:ascii="Times New Roman" w:hAnsi="Times New Roman"/>
+          <w:i/>
+          <w:sz w:val="20"/>
+          <w:u w:val="single"/>
+        </w:rPr>
+        <w:t>project.documentation</w:t>
+      </w:r>
+      <w:proofErr w:type="spellEnd"/>
+      <w:proofErr w:type="gramEnd"/>
+      <w:r>
+        <w:rPr>
+          <w:rFonts w:ascii="Times New Roman" w:hAnsi="Times New Roman"/>
+          <w:i/>
+          <w:sz w:val="20"/>
+          <w:u w:val="single"/>
+        </w:rPr>
+        <w:t>]&gt;&gt;</w:t>
+      </w:r>
+    </w:p>
+    <w:p>
+      <w:pPr>
+        <w:spacing w:after="0" w:line="240" w:lineRule="auto"/>
+        <w:jc w:val="center"/>
+        <w:rPr>
+          <w:rFonts w:ascii="Times New Roman" w:hAnsi="Times New Roman"/>
+          <w:i/>
+          <w:sz w:val="14"/>
+          <w:szCs w:val="16"/>
+        </w:rPr>
+      </w:pPr>
+      <w:r>
+        <w:rPr>
+          <w:rFonts w:ascii="Times New Roman" w:hAnsi="Times New Roman"/>
+          <w:i/>
+          <w:sz w:val="14"/>
+          <w:szCs w:val="16"/>
+        </w:rPr>
         <w:t>(номер, другие реквизиты чертежа, наименование проектной и</w:t>
       </w:r>
       <w:r>
@@ -1386,44 +1379,9 @@
           <w:u w:val="single"/>
           <w:lang w:val="en-US"/>
         </w:rPr>
-        <w:t>&lt;&lt;foreach [material in materials.items]&gt;&gt;&lt;&lt;[material.displayText]&gt;&gt;</w:t>
-      </w:r>
-      <w:r>
-        <w:rPr>
-          <w:rFonts w:ascii="Times New Roman" w:hAnsi="Times New Roman"/>
-          <w:i/>
-          <w:sz w:val="20"/>
-          <w:u w:val="single"/>
-          <w:lang w:val="en-US"/>
-        </w:rPr>
-      </w:r>
-      <w:r>
-        <w:rPr>
-          <w:rFonts w:ascii="Times New Roman" w:hAnsi="Times New Roman"/>
-          <w:i/>
-          <w:sz w:val="20"/>
-          <w:u w:val="single"/>
-          <w:lang w:val="en-US"/>
-        </w:rPr>
-      </w:r>
-      <w:r>
-        <w:rPr>
-          <w:rFonts w:ascii="Times New Roman" w:hAnsi="Times New Roman"/>
-          <w:i/>
-          <w:sz w:val="20"/>
-          <w:u w:val="single"/>
-          <w:lang w:val="en-US"/>
-        </w:rPr>
-      </w:r>
-      <w:r>
-        <w:rPr>
-          <w:rFonts w:ascii="Times New Roman" w:hAnsi="Times New Roman"/>
-          <w:i/>
-          <w:sz w:val="20"/>
-          <w:u w:val="single"/>
-          <w:lang w:val="en-US"/>
-        </w:rPr>
-      </w:r>
+        <w:t xml:space="preserve">&lt;&lt;foreach [material in </w:t>
+      </w:r>
+      <w:proofErr w:type="spellStart"/>
       <w:proofErr w:type="gramStart"/>
       <w:r>
         <w:rPr>
@@ -1433,25 +1391,9 @@
           <w:u w:val="single"/>
           <w:lang w:val="en-US"/>
         </w:rPr>
-      </w:r>
-      <w:r>
-        <w:rPr>
-          <w:rFonts w:ascii="Times New Roman" w:hAnsi="Times New Roman"/>
-          <w:i/>
-          <w:sz w:val="20"/>
-          <w:u w:val="single"/>
-          <w:lang w:val="en-US"/>
-        </w:rPr>
-      </w:r>
-      <w:r>
-        <w:rPr>
-          <w:rFonts w:ascii="Times New Roman" w:hAnsi="Times New Roman"/>
-          <w:i/>
-          <w:sz w:val="20"/>
-          <w:u w:val="single"/>
-          <w:lang w:val="en-US"/>
-        </w:rPr>
-      </w:r>
+        <w:t>materials.items</w:t>
+      </w:r>
+      <w:proofErr w:type="spellEnd"/>
       <w:proofErr w:type="gramEnd"/>
       <w:r>
         <w:rPr>
@@ -1461,44 +1403,31 @@
           <w:u w:val="single"/>
           <w:lang w:val="en-US"/>
         </w:rPr>
-      </w:r>
-      <w:r>
-        <w:rPr>
-          <w:rFonts w:ascii="Times New Roman" w:hAnsi="Times New Roman"/>
-          <w:i/>
-          <w:sz w:val="20"/>
-          <w:u w:val="single"/>
-          <w:lang w:val="en-US"/>
-        </w:rPr>
-      </w:r>
-      <w:r>
-        <w:rPr>
-          <w:rFonts w:ascii="Times New Roman" w:hAnsi="Times New Roman"/>
-          <w:i/>
-          <w:sz w:val="20"/>
-          <w:u w:val="single"/>
-          <w:lang w:val="en-US"/>
-        </w:rPr>
+        <w:t>]&gt;&gt;&lt;&lt;[</w:t>
       </w:r>
       <w:proofErr w:type="spellStart"/>
-      <w:r>
-        <w:rPr>
-          <w:rFonts w:ascii="Times New Roman" w:hAnsi="Times New Roman"/>
-          <w:i/>
-          <w:sz w:val="20"/>
-          <w:u w:val="single"/>
-          <w:lang w:val="en-US"/>
-        </w:rPr>
+      <w:proofErr w:type="gramStart"/>
+      <w:r>
+        <w:rPr>
+          <w:rFonts w:ascii="Times New Roman" w:hAnsi="Times New Roman"/>
+          <w:i/>
+          <w:sz w:val="20"/>
+          <w:u w:val="single"/>
+          <w:lang w:val="en-US"/>
+        </w:rPr>
+        <w:t>material.displayText</w:t>
       </w:r>
       <w:proofErr w:type="spellEnd"/>
-      <w:r>
-        <w:rPr>
-          <w:rFonts w:ascii="Times New Roman" w:hAnsi="Times New Roman"/>
-          <w:i/>
-          <w:sz w:val="20"/>
-          <w:u w:val="single"/>
-          <w:lang w:val="en-US"/>
-        </w:rPr>
+      <w:proofErr w:type="gramEnd"/>
+      <w:r>
+        <w:rPr>
+          <w:rFonts w:ascii="Times New Roman" w:hAnsi="Times New Roman"/>
+          <w:i/>
+          <w:sz w:val="20"/>
+          <w:u w:val="single"/>
+          <w:lang w:val="en-US"/>
+        </w:rPr>
+        <w:t>]&gt;&gt;</w:t>
       </w:r>
     </w:p>
     <w:p>
@@ -1733,7 +1662,7 @@
           <w:u w:val="single"/>
           <w:lang w:val="en-US"/>
         </w:rPr>
-        <w:t>&lt;&lt;foreach [document in confirmationDocuments.items]&gt;&gt;&lt;&lt;[document.displayText]&gt;&gt;</w:t>
+        <w:t xml:space="preserve">&lt;&lt;foreach [document in </w:t>
       </w:r>
       <w:proofErr w:type="spellStart"/>
       <w:r>
@@ -1744,6 +1673,7 @@
           <w:u w:val="single"/>
           <w:lang w:val="en-US"/>
         </w:rPr>
+        <w:t>confirmationDocuments.items</w:t>
       </w:r>
       <w:proofErr w:type="spellEnd"/>
       <w:r>
@@ -1754,6 +1684,29 @@
           <w:u w:val="single"/>
           <w:lang w:val="en-US"/>
         </w:rPr>
+        <w:t>]&gt;&gt;&lt;&lt;[</w:t>
+      </w:r>
+      <w:proofErr w:type="spellStart"/>
+      <w:r>
+        <w:rPr>
+          <w:rFonts w:ascii="Times New Roman" w:hAnsi="Times New Roman"/>
+          <w:i/>
+          <w:sz w:val="20"/>
+          <w:u w:val="single"/>
+          <w:lang w:val="en-US"/>
+        </w:rPr>
+        <w:t>document.displayText</w:t>
+      </w:r>
+      <w:proofErr w:type="spellEnd"/>
+      <w:r>
+        <w:rPr>
+          <w:rFonts w:ascii="Times New Roman" w:hAnsi="Times New Roman"/>
+          <w:i/>
+          <w:sz w:val="20"/>
+          <w:u w:val="single"/>
+          <w:lang w:val="en-US"/>
+        </w:rPr>
+        <w:t>]&gt;&gt;</w:t>
       </w:r>
     </w:p>
     <w:p>
@@ -1931,8 +1884,9 @@
           <w:sz w:val="20"/>
           <w:u w:val="single"/>
         </w:rPr>
-        <w:t>&lt;&lt;[work.startDateLine]&gt;&gt;</w:t>
-      </w:r>
+        <w:t>&lt;&lt;[</w:t>
+      </w:r>
+      <w:proofErr w:type="spellStart"/>
       <w:proofErr w:type="gramStart"/>
       <w:r>
         <w:rPr>
@@ -1941,28 +1895,8 @@
           <w:iCs/>
           <w:sz w:val="20"/>
           <w:u w:val="single"/>
-          <w:lang w:val="en-US"/>
-        </w:rPr>
-      </w:r>
-      <w:r>
-        <w:rPr>
-          <w:rFonts w:ascii="Times New Roman" w:hAnsi="Times New Roman"/>
-          <w:i/>
-          <w:iCs/>
-          <w:sz w:val="20"/>
-          <w:u w:val="single"/>
-        </w:rPr>
-      </w:r>
-      <w:proofErr w:type="spellStart"/>
-      <w:r>
-        <w:rPr>
-          <w:rFonts w:ascii="Times New Roman" w:hAnsi="Times New Roman"/>
-          <w:i/>
-          <w:iCs/>
-          <w:sz w:val="20"/>
-          <w:u w:val="single"/>
-          <w:lang w:val="en-US"/>
-        </w:rPr>
+        </w:rPr>
+        <w:t>work.startDateLine</w:t>
       </w:r>
       <w:proofErr w:type="spellEnd"/>
       <w:proofErr w:type="gramEnd"/>
@@ -1974,6 +1908,7 @@
           <w:sz w:val="20"/>
           <w:u w:val="single"/>
         </w:rPr>
+        <w:t>]&gt;&gt;</w:t>
       </w:r>
     </w:p>
     <w:p>
@@ -2033,8 +1968,9 @@
           <w:sz w:val="20"/>
           <w:u w:val="single"/>
         </w:rPr>
-        <w:t>&lt;&lt;[work.endDateLine]&gt;&gt;</w:t>
-      </w:r>
+        <w:t>&lt;&lt;[</w:t>
+      </w:r>
+      <w:proofErr w:type="spellStart"/>
       <w:proofErr w:type="gramStart"/>
       <w:r>
         <w:rPr>
@@ -2043,28 +1979,8 @@
           <w:iCs/>
           <w:sz w:val="20"/>
           <w:u w:val="single"/>
-          <w:lang w:val="en-US"/>
-        </w:rPr>
-      </w:r>
-      <w:r>
-        <w:rPr>
-          <w:rFonts w:ascii="Times New Roman" w:hAnsi="Times New Roman"/>
-          <w:i/>
-          <w:iCs/>
-          <w:sz w:val="20"/>
-          <w:u w:val="single"/>
-        </w:rPr>
-      </w:r>
-      <w:proofErr w:type="spellStart"/>
-      <w:r>
-        <w:rPr>
-          <w:rFonts w:ascii="Times New Roman" w:hAnsi="Times New Roman"/>
-          <w:i/>
-          <w:iCs/>
-          <w:sz w:val="20"/>
-          <w:u w:val="single"/>
-          <w:lang w:val="en-US"/>
-        </w:rPr>
+        </w:rPr>
+        <w:t>work.endDateLine</w:t>
       </w:r>
       <w:proofErr w:type="spellEnd"/>
       <w:proofErr w:type="gramEnd"/>
@@ -2076,6 +1992,7 @@
           <w:sz w:val="20"/>
           <w:u w:val="single"/>
         </w:rPr>
+        <w:t>]&gt;&gt;</w:t>
       </w:r>
     </w:p>
     <w:p>
@@ -2195,7 +2112,7 @@
           <w:sz w:val="20"/>
           <w:u w:val="single"/>
         </w:rPr>
-        <w:t>&lt;&lt;[project.compliance]&gt;&gt;</w:t>
+        <w:t>&lt;&lt;[</w:t>
       </w:r>
       <w:proofErr w:type="spellStart"/>
       <w:proofErr w:type="gramStart"/>
@@ -2207,6 +2124,7 @@
           <w:sz w:val="20"/>
           <w:u w:val="single"/>
         </w:rPr>
+        <w:t>project.compliance</w:t>
       </w:r>
       <w:proofErr w:type="spellEnd"/>
       <w:proofErr w:type="gramEnd"/>
@@ -2218,6 +2136,7 @@
           <w:sz w:val="20"/>
           <w:u w:val="single"/>
         </w:rPr>
+        <w:t>]&gt;&gt;</w:t>
       </w:r>
     </w:p>
     <w:p>
@@ -2372,7 +2291,7 @@
           <w:sz w:val="20"/>
           <w:u w:val="single"/>
         </w:rPr>
-        <w:t>&lt;&lt;[work.nextWorks]&gt;&gt;</w:t>
+        <w:t>&lt;&lt;[</w:t>
       </w:r>
       <w:proofErr w:type="spellStart"/>
       <w:proofErr w:type="gramStart"/>
@@ -2384,6 +2303,7 @@
           <w:sz w:val="20"/>
           <w:u w:val="single"/>
         </w:rPr>
+        <w:t>work.nextWorks</w:t>
       </w:r>
       <w:proofErr w:type="spellEnd"/>
       <w:proofErr w:type="gramEnd"/>
@@ -2395,6 +2315,7 @@
           <w:sz w:val="20"/>
           <w:u w:val="single"/>
         </w:rPr>
+        <w:t>]&gt;&gt;</w:t>
       </w:r>
     </w:p>
     <w:p>
@@ -2475,7 +2396,7 @@
           <w:sz w:val="20"/>
           <w:u w:val="single"/>
         </w:rPr>
-        <w:t>&lt;&lt;[document.additionalInfo]&gt;&gt;</w:t>
+        <w:t>&lt;&lt;[</w:t>
       </w:r>
       <w:proofErr w:type="spellStart"/>
       <w:proofErr w:type="gramStart"/>
@@ -2485,6 +2406,7 @@
           <w:sz w:val="20"/>
           <w:u w:val="single"/>
         </w:rPr>
+        <w:t>document.additionalInfo</w:t>
       </w:r>
       <w:proofErr w:type="spellEnd"/>
       <w:proofErr w:type="gramEnd"/>
@@ -2494,6 +2416,7 @@
           <w:sz w:val="20"/>
           <w:u w:val="single"/>
         </w:rPr>
+        <w:t>]&gt;&gt;</w:t>
       </w:r>
     </w:p>
     <w:p>
@@ -2553,36 +2476,6 @@
           <w:sz w:val="20"/>
         </w:rPr>
         <w:t>&lt;&lt;[document.copiesLine]&gt;&gt;</w:t>
-      </w:r>
-      <w:proofErr w:type="gramStart"/>
-      <w:r>
-        <w:rPr>
-          <w:rFonts w:ascii="Times New Roman" w:hAnsi="Times New Roman"/>
-          <w:sz w:val="20"/>
-          <w:lang w:val="en-US"/>
-        </w:rPr>
-      </w:r>
-      <w:r>
-        <w:rPr>
-          <w:rFonts w:ascii="Times New Roman" w:hAnsi="Times New Roman"/>
-          <w:sz w:val="20"/>
-        </w:rPr>
-      </w:r>
-      <w:proofErr w:type="spellStart"/>
-      <w:r>
-        <w:rPr>
-          <w:rFonts w:ascii="Times New Roman" w:hAnsi="Times New Roman"/>
-          <w:sz w:val="20"/>
-          <w:lang w:val="en-US"/>
-        </w:rPr>
-      </w:r>
-      <w:proofErr w:type="spellEnd"/>
-      <w:proofErr w:type="gramEnd"/>
-      <w:r>
-        <w:rPr>
-          <w:rFonts w:ascii="Times New Roman" w:hAnsi="Times New Roman"/>
-          <w:sz w:val="20"/>
-        </w:rPr>
       </w:r>
       <w:r>
         <w:rPr>
@@ -2654,7 +2547,7 @@
           <w:u w:val="single"/>
           <w:lang w:val="en-US"/>
         </w:rPr>
-        <w:t>&lt;&lt;foreach [application in applications.items]&gt;&gt;&lt;&lt;[application.displayText]&gt;&gt;</w:t>
+        <w:t xml:space="preserve">&lt;&lt;foreach [application in </w:t>
       </w:r>
       <w:proofErr w:type="spellStart"/>
       <w:proofErr w:type="gramStart"/>
@@ -2666,6 +2559,7 @@
           <w:u w:val="single"/>
           <w:lang w:val="en-US"/>
         </w:rPr>
+        <w:t>applications.items</w:t>
       </w:r>
       <w:proofErr w:type="spellEnd"/>
       <w:proofErr w:type="gramEnd"/>
@@ -2677,6 +2571,31 @@
           <w:u w:val="single"/>
           <w:lang w:val="en-US"/>
         </w:rPr>
+        <w:t>]&gt;&gt;&lt;&lt;[</w:t>
+      </w:r>
+      <w:proofErr w:type="spellStart"/>
+      <w:proofErr w:type="gramStart"/>
+      <w:r>
+        <w:rPr>
+          <w:rFonts w:ascii="Times New Roman" w:hAnsi="Times New Roman"/>
+          <w:i/>
+          <w:sz w:val="20"/>
+          <w:u w:val="single"/>
+          <w:lang w:val="en-US"/>
+        </w:rPr>
+        <w:t>application.displayText</w:t>
+      </w:r>
+      <w:proofErr w:type="spellEnd"/>
+      <w:proofErr w:type="gramEnd"/>
+      <w:r>
+        <w:rPr>
+          <w:rFonts w:ascii="Times New Roman" w:hAnsi="Times New Roman"/>
+          <w:i/>
+          <w:sz w:val="20"/>
+          <w:u w:val="single"/>
+          <w:lang w:val="en-US"/>
+        </w:rPr>
+        <w:t>]&gt;&gt;</w:t>
       </w:r>
     </w:p>
     <w:p>
@@ -2782,8 +2701,7 @@
           <w:sz w:val="20"/>
           <w:lang w:val="en-US"/>
         </w:rPr>
-        <w:tab/>
-        <w:t>&lt;&lt;foreach [group in representatives.groups]&gt;&gt;&lt;&lt;[group.title]&gt;&gt;:</w:t>
+        <w:t xml:space="preserve">&lt;&lt;foreach [group in </w:t>
       </w:r>
       <w:proofErr w:type="spellStart"/>
       <w:proofErr w:type="gramStart"/>
@@ -2794,6 +2712,7 @@
           <w:sz w:val="20"/>
           <w:lang w:val="en-US"/>
         </w:rPr>
+        <w:t>representatives.groups</w:t>
       </w:r>
       <w:proofErr w:type="spellEnd"/>
       <w:proofErr w:type="gramEnd"/>
@@ -2804,6 +2723,29 @@
           <w:sz w:val="20"/>
           <w:lang w:val="en-US"/>
         </w:rPr>
+        <w:t>]&gt;&gt;&lt;&lt;[</w:t>
+      </w:r>
+      <w:proofErr w:type="spellStart"/>
+      <w:proofErr w:type="gramStart"/>
+      <w:r>
+        <w:rPr>
+          <w:rFonts w:ascii="Times New Roman" w:hAnsi="Times New Roman"/>
+          <w:b/>
+          <w:sz w:val="20"/>
+          <w:lang w:val="en-US"/>
+        </w:rPr>
+        <w:t>group.title</w:t>
+      </w:r>
+      <w:proofErr w:type="spellEnd"/>
+      <w:proofErr w:type="gramEnd"/>
+      <w:r>
+        <w:rPr>
+          <w:rFonts w:ascii="Times New Roman" w:hAnsi="Times New Roman"/>
+          <w:b/>
+          <w:sz w:val="20"/>
+          <w:lang w:val="en-US"/>
+        </w:rPr>
+        <w:t>]&gt;&gt;:</w:t>
       </w:r>
     </w:p>
     <w:p>
@@ -2831,24 +2773,57 @@
           <w:lang w:val="en-US"/>
         </w:rPr>
         <w:tab/>
-        <w:t>&lt;&lt;foreach [member in group.members]&gt;&gt;&lt;&lt;[member.signatureText]&gt;&gt;</w:t>
+        <w:t xml:space="preserve">&lt;&lt;foreach [member in </w:t>
+      </w:r>
+      <w:proofErr w:type="spellStart"/>
+      <w:r>
+        <w:rPr>
+          <w:rFonts w:ascii="Times New Roman" w:hAnsi="Times New Roman"/>
+          <w:i/>
+          <w:sz w:val="20"/>
+          <w:lang w:val="en-US"/>
+        </w:rPr>
+        <w:t>group.members</w:t>
+      </w:r>
+      <w:proofErr w:type="spellEnd"/>
+      <w:r>
+        <w:rPr>
+          <w:rFonts w:ascii="Times New Roman" w:hAnsi="Times New Roman"/>
+          <w:i/>
+          <w:sz w:val="20"/>
+          <w:lang w:val="en-US"/>
+        </w:rPr>
+        <w:t>]&gt;&gt;&lt;&lt;[</w:t>
+      </w:r>
+      <w:proofErr w:type="spellStart"/>
+      <w:r>
+        <w:rPr>
+          <w:rFonts w:ascii="Times New Roman" w:hAnsi="Times New Roman"/>
+          <w:i/>
+          <w:sz w:val="20"/>
+          <w:lang w:val="en-US"/>
+        </w:rPr>
+        <w:t>member.signatureText</w:t>
+      </w:r>
+      <w:proofErr w:type="spellEnd"/>
+      <w:r>
+        <w:rPr>
+          <w:rFonts w:ascii="Times New Roman" w:hAnsi="Times New Roman"/>
+          <w:i/>
+          <w:sz w:val="20"/>
+          <w:lang w:val="en-US"/>
+        </w:rPr>
+        <w:t>]&gt;&gt;</w:t>
+      </w:r>
+      <w:r>
+        <w:rPr>
+          <w:rFonts w:ascii="Times New Roman" w:hAnsi="Times New Roman"/>
+          <w:i/>
+          <w:sz w:val="20"/>
+          <w:lang w:val="en-US"/>
+        </w:rPr>
         <w:tab/>
-        <w:t>&lt;&lt;[member.signatureName]&gt;&gt;</w:t>
-      </w:r>
-      <w:r>
-        <w:rPr>
-          <w:rFonts w:ascii="Times New Roman" w:hAnsi="Times New Roman"/>
-          <w:sz w:val="20"/>
-          <w:lang w:val="en-US"/>
-        </w:rPr>
-      </w:r>
-      <w:r>
-        <w:rPr>
-          <w:rFonts w:ascii="Times New Roman" w:hAnsi="Times New Roman"/>
-          <w:i/>
-          <w:sz w:val="20"/>
-          <w:lang w:val="en-US"/>
-        </w:rPr>
+        <w:t>&lt;&lt;[</w:t>
       </w:r>
       <w:proofErr w:type="spellStart"/>
       <w:r>
@@ -2858,6 +2833,7 @@
           <w:sz w:val="20"/>
           <w:lang w:val="en-US"/>
         </w:rPr>
+        <w:t>member.signatureName</w:t>
       </w:r>
       <w:proofErr w:type="spellEnd"/>
       <w:r>
@@ -2867,6 +2843,7 @@
           <w:sz w:val="20"/>
           <w:lang w:val="en-US"/>
         </w:rPr>
+        <w:t>]&gt;&gt;</w:t>
       </w:r>
     </w:p>
     <w:p>
@@ -2969,47 +2946,6 @@
           <w:szCs w:val="16"/>
         </w:rPr>
         <w:t>&lt;&lt;/foreach&gt;&gt;&lt;&lt;/foreach&gt;&gt;</w:t>
-      </w:r>
-      <w:proofErr w:type="spellStart"/>
-      <w:r>
-        <w:rPr>
-          <w:rFonts w:ascii="Times New Roman" w:hAnsi="Times New Roman"/>
-          <w:sz w:val="14"/>
-          <w:szCs w:val="16"/>
-        </w:rPr>
-      </w:r>
-      <w:proofErr w:type="spellEnd"/>
-      <w:proofErr w:type="gramStart"/>
-      <w:r>
-        <w:rPr>
-          <w:rFonts w:ascii="Times New Roman" w:hAnsi="Times New Roman"/>
-          <w:sz w:val="14"/>
-          <w:szCs w:val="16"/>
-        </w:rPr>
-      </w:r>
-      <w:proofErr w:type="gramEnd"/>
-      <w:r>
-        <w:rPr>
-          <w:rFonts w:ascii="Times New Roman" w:hAnsi="Times New Roman"/>
-          <w:sz w:val="14"/>
-          <w:szCs w:val="16"/>
-        </w:rPr>
-      </w:r>
-      <w:proofErr w:type="spellStart"/>
-      <w:r>
-        <w:rPr>
-          <w:rFonts w:ascii="Times New Roman" w:hAnsi="Times New Roman"/>
-          <w:sz w:val="14"/>
-          <w:szCs w:val="16"/>
-        </w:rPr>
-      </w:r>
-      <w:proofErr w:type="spellEnd"/>
-      <w:r>
-        <w:rPr>
-          <w:rFonts w:ascii="Times New Roman" w:hAnsi="Times New Roman"/>
-          <w:sz w:val="14"/>
-          <w:szCs w:val="16"/>
-        </w:rPr>
       </w:r>
     </w:p>
     <w:sectPr>
@@ -3023,7 +2959,7 @@
 </file>
 
 <file path=word/numbering.xml><?xml version="1.0" encoding="utf-8"?>
-<w:numbering xmlns:wpc="http://schemas.microsoft.com/office/word/2010/wordprocessingCanvas" xmlns:cx="http://schemas.microsoft.com/office/drawing/2014/chartex" xmlns:cx1="http://schemas.microsoft.com/office/drawing/2015/9/8/chartex" xmlns:cx2="http://schemas.microsoft.com/office/drawing/2015/10/21/chartex" xmlns:cx3="http://schemas.microsoft.com/office/drawing/2016/5/9/chartex" xmlns:cx4="http://schemas.microsoft.com/office/drawing/2016/5/10/chartex" xmlns:cx5="http://schemas.microsoft.com/office/drawing/2016/5/11/chartex" xmlns:cx6="http://schemas.microsoft.com/office/drawing/2016/5/12/chartex" xmlns:cx7="http://schemas.microsoft.com/office/drawing/2016/5/13/chartex" xmlns:cx8="http://schemas.microsoft.com/office/drawing/2016/5/14/chartex" xmlns:mc="http://schemas.openxmlformats.org/markup-compatibility/2006" xmlns:aink="http://schemas.microsoft.com/office/drawing/2016/ink" xmlns:am3d="http://schemas.microsoft.com/office/drawing/2017/model3d" xmlns:o="urn:schemas-microsoft-com:office:office" xmlns:oel="http://schemas.microsoft.com/office/2019/extlst" xmlns:r="http://schemas.openxmlformats.org/officeDocument/2006/relationships" xmlns:m="http://schemas.openxmlformats.org/officeDocument/2006/math" xmlns:v="urn:schemas-microsoft-com:vml" xmlns:wp14="http://schemas.microsoft.com/office/word/2010/wordprocessingDrawing" xmlns:wp="http://schemas.openxmlformats.org/drawingml/2006/wordprocessingDrawing" xmlns:w10="urn:schemas-microsoft-com:office:word" xmlns:w="http://schemas.openxmlformats.org/wordprocessingml/2006/main" xmlns:w14="http://schemas.microsoft.com/office/word/2010/wordml" xmlns:w15="http://schemas.microsoft.com/office/word/2012/wordml" xmlns:w16cex="http://schemas.microsoft.com/office/word/2018/wordml/cex" xmlns:w16cid="http://schemas.microsoft.com/office/word/2016/wordml/cid" xmlns:w16="http://schemas.microsoft.com/office/word/2018/wordml" xmlns:w16du="http://schemas.microsoft.com/office/word/2023/wordml/word16du" xmlns:w16sdtdh="http://schemas.microsoft.com/office/word/2020/wordml/sdtdatahash" xmlns:w16sdtfl="http://schemas.microsoft.com/office/word/2024/wordml/sdtformatlock" xmlns:w16se="http://schemas.microsoft.com/office/word/2015/wordml/symex" xmlns:wpg="http://schemas.microsoft.com/office/word/2010/wordprocessingGroup" xmlns:wpi="http://schemas.microsoft.com/office/word/2010/wordprocessingInk" xmlns:wne="http://schemas.microsoft.com/office/word/2006/wordml" xmlns:wps="http://schemas.microsoft.com/office/word/2010/wordprocessingShape" mc:Ignorable="w14 w15 w16se w16cid w16 w16cex w16sdtdh w16sdtfl w16du wp14">
+<w:numbering xmlns:wpc="http://schemas.microsoft.com/office/word/2010/wordprocessingCanvas" xmlns:cx="http://schemas.microsoft.com/office/drawing/2014/chartex" xmlns:cx1="http://schemas.microsoft.com/office/drawing/2015/9/8/chartex" xmlns:cx2="http://schemas.microsoft.com/office/drawing/2015/10/21/chartex" xmlns:cx3="http://schemas.microsoft.com/office/drawing/2016/5/9/chartex" xmlns:cx4="http://schemas.microsoft.com/office/drawing/2016/5/10/chartex" xmlns:cx5="http://schemas.microsoft.com/office/drawing/2016/5/11/chartex" xmlns:cx6="http://schemas.microsoft.com/office/drawing/2016/5/12/chartex" xmlns:cx7="http://schemas.microsoft.com/office/drawing/2016/5/13/chartex" xmlns:cx8="http://schemas.microsoft.com/office/drawing/2016/5/14/chartex" xmlns:mc="http://schemas.openxmlformats.org/markup-compatibility/2006" xmlns:m="http://schemas.openxmlformats.org/officeDocument/2006/math" xmlns:aink="http://schemas.microsoft.com/office/drawing/2016/ink" xmlns:am3d="http://schemas.microsoft.com/office/drawing/2017/model3d" xmlns:oel="http://schemas.microsoft.com/office/2019/extlst" xmlns:r="http://schemas.openxmlformats.org/officeDocument/2006/relationships" xmlns:wp14="http://schemas.microsoft.com/office/word/2010/wordprocessingDrawing" xmlns:wp="http://schemas.openxmlformats.org/drawingml/2006/wordprocessingDrawing" xmlns:wpg="http://schemas.microsoft.com/office/word/2010/wordprocessingGroup" xmlns:wpi="http://schemas.microsoft.com/office/word/2010/wordprocessingInk" xmlns:wps="http://schemas.microsoft.com/office/word/2010/wordprocessingShape" xmlns:o="urn:schemas-microsoft-com:office:office" xmlns:v="urn:schemas-microsoft-com:vml" xmlns:w10="urn:schemas-microsoft-com:office:word" xmlns:w="http://schemas.openxmlformats.org/wordprocessingml/2006/main" xmlns:w14="http://schemas.microsoft.com/office/word/2010/wordml" xmlns:w15="http://schemas.microsoft.com/office/word/2012/wordml" xmlns:w16cex="http://schemas.microsoft.com/office/word/2018/wordml/cex" xmlns:w16cid="http://schemas.microsoft.com/office/word/2016/wordml/cid" xmlns:w16="http://schemas.microsoft.com/office/word/2018/wordml" xmlns:w16sdtdh="http://schemas.microsoft.com/office/word/2020/wordml/sdtdatahash" xmlns:w16sdtfl="http://schemas.microsoft.com/office/word/2024/wordml/sdtformatlock" xmlns:w16se="http://schemas.microsoft.com/office/word/2015/wordml/symex" xmlns:w16du="http://schemas.microsoft.com/office/word/2023/wordml/word16du" xmlns:wne="http://schemas.microsoft.com/office/word/2006/wordml" mc:Ignorable="w14 w15 w16se w16cid w16 w16cex w16sdtdh w16sdtfl w16du wp14">
   <w:abstractNum w:abstractNumId="0" w15:restartNumberingAfterBreak="0">
     <w:nsid w:val="17F83616"/>
     <w:multiLevelType w:val="hybridMultilevel"/>
@@ -3311,7 +3247,7 @@
 </file>
 
 <file path=word/styles.xml><?xml version="1.0" encoding="utf-8"?>
-<w:styles xmlns:mc="http://schemas.openxmlformats.org/markup-compatibility/2006" xmlns:r="http://schemas.openxmlformats.org/officeDocument/2006/relationships" xmlns:w="http://schemas.openxmlformats.org/wordprocessingml/2006/main" xmlns:w14="http://schemas.microsoft.com/office/word/2010/wordml" xmlns:w15="http://schemas.microsoft.com/office/word/2012/wordml" xmlns:w16cex="http://schemas.microsoft.com/office/word/2018/wordml/cex" xmlns:w16cid="http://schemas.microsoft.com/office/word/2016/wordml/cid" xmlns:w16="http://schemas.microsoft.com/office/word/2018/wordml" xmlns:w16du="http://schemas.microsoft.com/office/word/2023/wordml/word16du" xmlns:w16sdtdh="http://schemas.microsoft.com/office/word/2020/wordml/sdtdatahash" xmlns:w16sdtfl="http://schemas.microsoft.com/office/word/2024/wordml/sdtformatlock" xmlns:w16se="http://schemas.microsoft.com/office/word/2015/wordml/symex" mc:Ignorable="w14 w15 w16se w16cid w16 w16cex w16sdtdh w16sdtfl w16du">
+<w:styles xmlns:mc="http://schemas.openxmlformats.org/markup-compatibility/2006" xmlns:r="http://schemas.openxmlformats.org/officeDocument/2006/relationships" xmlns:w="http://schemas.openxmlformats.org/wordprocessingml/2006/main" xmlns:w14="http://schemas.microsoft.com/office/word/2010/wordml" xmlns:w15="http://schemas.microsoft.com/office/word/2012/wordml" xmlns:w16cex="http://schemas.microsoft.com/office/word/2018/wordml/cex" xmlns:w16cid="http://schemas.microsoft.com/office/word/2016/wordml/cid" xmlns:w16="http://schemas.microsoft.com/office/word/2018/wordml" xmlns:w16sdtdh="http://schemas.microsoft.com/office/word/2020/wordml/sdtdatahash" xmlns:w16sdtfl="http://schemas.microsoft.com/office/word/2024/wordml/sdtformatlock" xmlns:w16se="http://schemas.microsoft.com/office/word/2015/wordml/symex" xmlns:w16du="http://schemas.microsoft.com/office/word/2023/wordml/word16du" mc:Ignorable="w14 w15 w16se w16cid w16 w16cex w16sdtdh w16sdtfl w16du">
   <w:docDefaults>
     <w:rPrDefault>
       <w:rPr>

</xml_diff>

<commit_message>
Stabilize AOSR DOCX preview layout
</commit_message>
<xml_diff>
--- a/apps/web/public/templates/aosr/AOSR1_template_final_tags_corrected.docx
+++ b/apps/web/public/templates/aosr/AOSR1_template_final_tags_corrected.docx
@@ -1799,202 +1799,264 @@
         </w:rPr>
       </w:pPr>
     </w:p>
-    <w:p>
-      <w:pPr>
-        <w:pStyle w:val="a3"/>
-        <w:tabs>
-          <w:tab w:val="left" w:pos="709"/>
-        </w:tabs>
-        <w:spacing w:after="0" w:line="240" w:lineRule="auto"/>
-        <w:ind w:left="0"/>
-        <w:jc w:val="both"/>
-        <w:rPr>
-          <w:rFonts w:ascii="Times New Roman" w:hAnsi="Times New Roman"/>
-          <w:sz w:val="20"/>
-        </w:rPr>
-      </w:pPr>
-      <w:r>
-        <w:rPr>
-          <w:rFonts w:ascii="Times New Roman" w:hAnsi="Times New Roman"/>
-          <w:sz w:val="20"/>
-        </w:rPr>
-        <w:t>5.</w:t>
-      </w:r>
-      <w:r>
-        <w:rPr>
-          <w:rFonts w:ascii="Times New Roman" w:hAnsi="Times New Roman"/>
-          <w:sz w:val="20"/>
-        </w:rPr>
-        <w:tab/>
-      </w:r>
-      <w:r>
-        <w:rPr>
-          <w:rFonts w:ascii="Times New Roman" w:hAnsi="Times New Roman"/>
-          <w:sz w:val="20"/>
-        </w:rPr>
-        <w:t>Даты</w:t>
-      </w:r>
-      <w:r>
-        <w:rPr>
-          <w:rFonts w:ascii="Times New Roman" w:hAnsi="Times New Roman"/>
-          <w:sz w:val="20"/>
-        </w:rPr>
-        <w:t>:</w:t>
-      </w:r>
-      <w:r>
-        <w:rPr>
-          <w:rFonts w:ascii="Times New Roman" w:hAnsi="Times New Roman"/>
-          <w:sz w:val="20"/>
-        </w:rPr>
-        <w:tab/>
-      </w:r>
-      <w:r>
-        <w:rPr>
-          <w:rFonts w:ascii="Times New Roman" w:hAnsi="Times New Roman"/>
-          <w:sz w:val="20"/>
-        </w:rPr>
-        <w:t>начала</w:t>
-      </w:r>
-      <w:r>
-        <w:rPr>
-          <w:rFonts w:ascii="Times New Roman" w:hAnsi="Times New Roman"/>
-          <w:sz w:val="20"/>
-        </w:rPr>
-        <w:t xml:space="preserve"> </w:t>
-      </w:r>
-      <w:r>
-        <w:rPr>
-          <w:rFonts w:ascii="Times New Roman" w:hAnsi="Times New Roman"/>
-          <w:sz w:val="20"/>
-        </w:rPr>
-        <w:t>работ</w:t>
-      </w:r>
-      <w:r>
-        <w:rPr>
-          <w:rFonts w:ascii="Times New Roman" w:hAnsi="Times New Roman"/>
-          <w:sz w:val="20"/>
-        </w:rPr>
-        <w:tab/>
-      </w:r>
-      <w:r>
-        <w:rPr>
-          <w:rFonts w:ascii="Times New Roman" w:hAnsi="Times New Roman"/>
-          <w:i/>
-          <w:iCs/>
-          <w:sz w:val="20"/>
-          <w:u w:val="single"/>
-        </w:rPr>
-        <w:t>&lt;&lt;[</w:t>
-      </w:r>
-      <w:proofErr w:type="spellStart"/>
-      <w:proofErr w:type="gramStart"/>
-      <w:r>
-        <w:rPr>
-          <w:rFonts w:ascii="Times New Roman" w:hAnsi="Times New Roman"/>
-          <w:i/>
-          <w:iCs/>
-          <w:sz w:val="20"/>
-          <w:u w:val="single"/>
-        </w:rPr>
-        <w:t>work.startDateLine</w:t>
-      </w:r>
-      <w:proofErr w:type="spellEnd"/>
-      <w:proofErr w:type="gramEnd"/>
-      <w:r>
-        <w:rPr>
-          <w:rFonts w:ascii="Times New Roman" w:hAnsi="Times New Roman"/>
-          <w:i/>
-          <w:iCs/>
-          <w:sz w:val="20"/>
-          <w:u w:val="single"/>
-        </w:rPr>
-        <w:t>]&gt;&gt;</w:t>
-      </w:r>
-    </w:p>
-    <w:p>
-      <w:pPr>
-        <w:tabs>
-          <w:tab w:val="right" w:pos="2552"/>
-        </w:tabs>
-        <w:spacing w:after="0" w:line="240" w:lineRule="auto"/>
-        <w:jc w:val="both"/>
-        <w:rPr>
-          <w:rFonts w:ascii="Times New Roman" w:hAnsi="Times New Roman"/>
-          <w:i/>
-          <w:sz w:val="20"/>
-          <w:u w:val="single"/>
-        </w:rPr>
-      </w:pPr>
-      <w:r>
-        <w:rPr>
-          <w:rFonts w:ascii="Times New Roman" w:hAnsi="Times New Roman"/>
-          <w:sz w:val="20"/>
-        </w:rPr>
-        <w:tab/>
-      </w:r>
-      <w:r>
-        <w:rPr>
-          <w:rFonts w:ascii="Times New Roman" w:hAnsi="Times New Roman"/>
-          <w:sz w:val="20"/>
-        </w:rPr>
-        <w:t>окончания</w:t>
-      </w:r>
-      <w:r>
-        <w:rPr>
-          <w:rFonts w:ascii="Times New Roman" w:hAnsi="Times New Roman"/>
-          <w:sz w:val="20"/>
-        </w:rPr>
-        <w:t xml:space="preserve"> </w:t>
-      </w:r>
-      <w:r>
-        <w:rPr>
-          <w:rFonts w:ascii="Times New Roman" w:hAnsi="Times New Roman"/>
-          <w:sz w:val="20"/>
-        </w:rPr>
-        <w:t>работ</w:t>
-      </w:r>
-      <w:r>
-        <w:rPr>
-          <w:rFonts w:ascii="Times New Roman" w:hAnsi="Times New Roman"/>
-          <w:sz w:val="20"/>
-        </w:rPr>
-        <w:tab/>
-      </w:r>
-      <w:r>
-        <w:rPr>
-          <w:rFonts w:ascii="Times New Roman" w:hAnsi="Times New Roman"/>
-          <w:i/>
-          <w:iCs/>
-          <w:sz w:val="20"/>
-          <w:u w:val="single"/>
-        </w:rPr>
-        <w:t>&lt;&lt;[</w:t>
-      </w:r>
-      <w:proofErr w:type="spellStart"/>
-      <w:proofErr w:type="gramStart"/>
-      <w:r>
-        <w:rPr>
-          <w:rFonts w:ascii="Times New Roman" w:hAnsi="Times New Roman"/>
-          <w:i/>
-          <w:iCs/>
-          <w:sz w:val="20"/>
-          <w:u w:val="single"/>
-        </w:rPr>
-        <w:t>work.endDateLine</w:t>
-      </w:r>
-      <w:proofErr w:type="spellEnd"/>
-      <w:proofErr w:type="gramEnd"/>
-      <w:r>
-        <w:rPr>
-          <w:rFonts w:ascii="Times New Roman" w:hAnsi="Times New Roman"/>
-          <w:i/>
-          <w:iCs/>
-          <w:sz w:val="20"/>
-          <w:u w:val="single"/>
-        </w:rPr>
-        <w:t>]&gt;&gt;</w:t>
-      </w:r>
-    </w:p>
+    <w:tbl>
+      <w:tblPr>
+        <w:tblW w:w="10488" w:type="dxa"/>
+        <w:tblLayout w:type="fixed"/>
+        <w:tblCellMar>
+          <w:top w:w="0" w:type="dxa"/>
+          <w:left w:w="120" w:type="dxa"/>
+          <w:bottom w:w="0" w:type="dxa"/>
+          <w:right w:w="120" w:type="dxa"/>
+        </w:tblCellMar>
+      </w:tblPr>
+      <w:tblGrid>
+        <w:gridCol w:w="760"/>
+        <w:gridCol w:w="1400"/>
+        <w:gridCol w:w="2050"/>
+        <w:gridCol w:w="6278"/>
+      </w:tblGrid>
+      <w:tr>
+        <w:tc>
+          <w:tcPr>
+            <w:tcW w:w="760" w:type="dxa"/>
+            <w:tcMar>
+              <w:top w:w="0" w:type="dxa"/>
+              <w:left w:w="0" w:type="dxa"/>
+              <w:bottom w:w="0" w:type="dxa"/>
+              <w:right w:w="120" w:type="dxa"/>
+            </w:tcMar>
+          </w:tcPr>
+          <w:p>
+            <w:pPr>
+              <w:spacing w:after="0" w:line="240" w:lineRule="auto"/>
+              <w:jc w:val="left"/>
+              <w:rPr>
+                <w:rFonts w:ascii="Times New Roman" w:hAnsi="Times New Roman"/>
+                <w:sz w:val="20"/>
+              </w:rPr>
+            </w:pPr>
+            <w:r>
+              <w:rPr>
+                <w:rFonts w:ascii="Times New Roman" w:hAnsi="Times New Roman"/>
+                <w:sz w:val="20"/>
+              </w:rPr>
+              <w:t>5.</w:t>
+            </w:r>
+          </w:p>
+        </w:tc>
+        <w:tc>
+          <w:tcPr>
+            <w:tcW w:w="1400" w:type="dxa"/>
+            <w:tcMar>
+              <w:top w:w="0" w:type="dxa"/>
+              <w:left w:w="120" w:type="dxa"/>
+              <w:bottom w:w="0" w:type="dxa"/>
+              <w:right w:w="120" w:type="dxa"/>
+            </w:tcMar>
+          </w:tcPr>
+          <w:p>
+            <w:pPr>
+              <w:spacing w:after="0" w:line="240" w:lineRule="auto"/>
+              <w:jc w:val="left"/>
+              <w:rPr>
+                <w:rFonts w:ascii="Times New Roman" w:hAnsi="Times New Roman"/>
+                <w:sz w:val="20"/>
+              </w:rPr>
+            </w:pPr>
+            <w:r>
+              <w:rPr>
+                <w:rFonts w:ascii="Times New Roman" w:hAnsi="Times New Roman"/>
+                <w:sz w:val="20"/>
+              </w:rPr>
+              <w:t>Даты:</w:t>
+            </w:r>
+          </w:p>
+        </w:tc>
+        <w:tc>
+          <w:tcPr>
+            <w:tcW w:w="2050" w:type="dxa"/>
+            <w:tcMar>
+              <w:top w:w="0" w:type="dxa"/>
+              <w:left w:w="120" w:type="dxa"/>
+              <w:bottom w:w="0" w:type="dxa"/>
+              <w:right w:w="120" w:type="dxa"/>
+            </w:tcMar>
+          </w:tcPr>
+          <w:p>
+            <w:pPr>
+              <w:spacing w:after="0" w:line="240" w:lineRule="auto"/>
+              <w:jc w:val="left"/>
+              <w:rPr>
+                <w:rFonts w:ascii="Times New Roman" w:hAnsi="Times New Roman"/>
+                <w:sz w:val="20"/>
+              </w:rPr>
+            </w:pPr>
+            <w:r>
+              <w:rPr>
+                <w:rFonts w:ascii="Times New Roman" w:hAnsi="Times New Roman"/>
+                <w:sz w:val="20"/>
+              </w:rPr>
+              <w:t>начала работ</w:t>
+            </w:r>
+          </w:p>
+        </w:tc>
+        <w:tc>
+          <w:tcPr>
+            <w:tcW w:w="6278" w:type="dxa"/>
+            <w:tcMar>
+              <w:top w:w="0" w:type="dxa"/>
+              <w:left w:w="120" w:type="dxa"/>
+              <w:bottom w:w="0" w:type="dxa"/>
+              <w:right w:w="120" w:type="dxa"/>
+            </w:tcMar>
+          </w:tcPr>
+          <w:p>
+            <w:pPr>
+              <w:spacing w:after="0" w:line="240" w:lineRule="auto"/>
+              <w:jc w:val="left"/>
+              <w:rPr>
+                <w:rFonts w:ascii="Times New Roman" w:hAnsi="Times New Roman"/>
+                <w:i/>
+                <w:iCs/>
+                <w:sz w:val="20"/>
+                <w:u w:val="single"/>
+              </w:rPr>
+            </w:pPr>
+            <w:r>
+              <w:rPr>
+                <w:rFonts w:ascii="Times New Roman" w:hAnsi="Times New Roman"/>
+                <w:i/>
+                <w:iCs/>
+                <w:sz w:val="20"/>
+                <w:u w:val="single"/>
+              </w:rPr>
+              <w:t>&lt;&lt;[work.startDateLine]&gt;&gt;</w:t>
+            </w:r>
+          </w:p>
+        </w:tc>
+      </w:tr>
+      <w:tr>
+        <w:tc>
+          <w:tcPr>
+            <w:tcW w:w="760" w:type="dxa"/>
+            <w:tcMar>
+              <w:top w:w="0" w:type="dxa"/>
+              <w:left w:w="0" w:type="dxa"/>
+              <w:bottom w:w="0" w:type="dxa"/>
+              <w:right w:w="120" w:type="dxa"/>
+            </w:tcMar>
+          </w:tcPr>
+          <w:p>
+            <w:pPr>
+              <w:spacing w:after="0" w:line="240" w:lineRule="auto"/>
+              <w:jc w:val="left"/>
+              <w:rPr>
+                <w:rFonts w:ascii="Times New Roman" w:hAnsi="Times New Roman"/>
+                <w:sz w:val="20"/>
+              </w:rPr>
+            </w:pPr>
+            <w:r>
+              <w:rPr>
+                <w:rFonts w:ascii="Times New Roman" w:hAnsi="Times New Roman"/>
+                <w:sz w:val="20"/>
+              </w:rPr>
+              <w:t/>
+            </w:r>
+          </w:p>
+        </w:tc>
+        <w:tc>
+          <w:tcPr>
+            <w:tcW w:w="1400" w:type="dxa"/>
+            <w:tcMar>
+              <w:top w:w="0" w:type="dxa"/>
+              <w:left w:w="120" w:type="dxa"/>
+              <w:bottom w:w="0" w:type="dxa"/>
+              <w:right w:w="120" w:type="dxa"/>
+            </w:tcMar>
+          </w:tcPr>
+          <w:p>
+            <w:pPr>
+              <w:spacing w:after="0" w:line="240" w:lineRule="auto"/>
+              <w:jc w:val="left"/>
+              <w:rPr>
+                <w:rFonts w:ascii="Times New Roman" w:hAnsi="Times New Roman"/>
+                <w:sz w:val="20"/>
+              </w:rPr>
+            </w:pPr>
+            <w:r>
+              <w:rPr>
+                <w:rFonts w:ascii="Times New Roman" w:hAnsi="Times New Roman"/>
+                <w:sz w:val="20"/>
+              </w:rPr>
+              <w:t/>
+            </w:r>
+          </w:p>
+        </w:tc>
+        <w:tc>
+          <w:tcPr>
+            <w:tcW w:w="2050" w:type="dxa"/>
+            <w:tcMar>
+              <w:top w:w="0" w:type="dxa"/>
+              <w:left w:w="120" w:type="dxa"/>
+              <w:bottom w:w="0" w:type="dxa"/>
+              <w:right w:w="120" w:type="dxa"/>
+            </w:tcMar>
+          </w:tcPr>
+          <w:p>
+            <w:pPr>
+              <w:spacing w:after="0" w:line="240" w:lineRule="auto"/>
+              <w:jc w:val="left"/>
+              <w:rPr>
+                <w:rFonts w:ascii="Times New Roman" w:hAnsi="Times New Roman"/>
+                <w:sz w:val="20"/>
+              </w:rPr>
+            </w:pPr>
+            <w:r>
+              <w:rPr>
+                <w:rFonts w:ascii="Times New Roman" w:hAnsi="Times New Roman"/>
+                <w:sz w:val="20"/>
+              </w:rPr>
+              <w:t>окончания работ</w:t>
+            </w:r>
+          </w:p>
+        </w:tc>
+        <w:tc>
+          <w:tcPr>
+            <w:tcW w:w="6278" w:type="dxa"/>
+            <w:tcMar>
+              <w:top w:w="0" w:type="dxa"/>
+              <w:left w:w="120" w:type="dxa"/>
+              <w:bottom w:w="0" w:type="dxa"/>
+              <w:right w:w="120" w:type="dxa"/>
+            </w:tcMar>
+          </w:tcPr>
+          <w:p>
+            <w:pPr>
+              <w:spacing w:after="0" w:line="240" w:lineRule="auto"/>
+              <w:jc w:val="left"/>
+              <w:rPr>
+                <w:rFonts w:ascii="Times New Roman" w:hAnsi="Times New Roman"/>
+                <w:i/>
+                <w:iCs/>
+                <w:sz w:val="20"/>
+                <w:u w:val="single"/>
+              </w:rPr>
+            </w:pPr>
+            <w:r>
+              <w:rPr>
+                <w:rFonts w:ascii="Times New Roman" w:hAnsi="Times New Roman"/>
+                <w:i/>
+                <w:iCs/>
+                <w:sz w:val="20"/>
+                <w:u w:val="single"/>
+              </w:rPr>
+              <w:t>&lt;&lt;[work.endDateLine]&gt;&gt;</w:t>
+            </w:r>
+          </w:p>
+        </w:tc>
+      </w:tr>
+    </w:tbl>
     <w:p>
       <w:pPr>
         <w:spacing w:after="0" w:line="240" w:lineRule="auto"/>

</xml_diff>